<commit_message>
Documentation des délégations (FR/EN) et guides régénérés
Co-Authored-By: Claude Opus 5.5 <noreply@anthropic.com>
Claude-Session: https://claude.ai/code/session_014Nnx55juzv7J6Z4kH5PphN
</commit_message>
<xml_diff>
--- a/wawid/docs/guides/WawID-Guide-utilisateur.docx
+++ b/wawid/docs/guides/WawID-Guide-utilisateur.docx
@@ -2009,7 +2009,36 @@
         <w:t xml:space="preserve">Dossiers</w:t>
       </w:r>
       <w:r>
-        <w:t xml:space="preserve">. Vous pouvez consulter les listes de surveillance et les règles, mais pas les modifier.</w:t>
+        <w:t xml:space="preserve">. Vous pouvez consulter les listes de surveillance et les règles, mais pas les modifier. Dans</w:t>
+      </w:r>
+      <w:r>
+        <w:t xml:space="preserve"> </w:t>
+      </w:r>
+      <w:r>
+        <w:rPr>
+          <w:bCs/>
+          <w:b/>
+        </w:rPr>
+        <w:t xml:space="preserve">e-Visa &amp; voyageurs</w:t>
+      </w:r>
+      <w:r>
+        <w:t xml:space="preserve">, la tuile</w:t>
+      </w:r>
+      <w:r>
+        <w:t xml:space="preserve"> </w:t>
+      </w:r>
+      <w:r>
+        <w:rPr>
+          <w:bCs/>
+          <w:b/>
+        </w:rPr>
+        <w:t xml:space="preserve">Délégations</w:t>
+      </w:r>
+      <w:r>
+        <w:t xml:space="preserve"> </w:t>
+      </w:r>
+      <w:r>
+        <w:t xml:space="preserve">vous permet de consulter les délégations attendues et de pointer l'arrivée de leurs membres.</w:t>
       </w:r>
     </w:p>
     <w:bookmarkEnd w:id="23"/>
@@ -3322,6 +3351,105 @@
               <w:jc w:val="left"/>
             </w:pPr>
             <w:r>
+              <w:t xml:space="preserve">Membre d'une délégation</w:t>
+            </w:r>
+          </w:p>
+        </w:tc>
+        <w:tc>
+          <w:tcPr/>
+          <w:p>
+            <w:pPr>
+              <w:pStyle w:val="Compact"/>
+              <w:jc w:val="left"/>
+            </w:pPr>
+            <w:r>
+              <w:t xml:space="preserve">Bandeau bleu</w:t>
+            </w:r>
+            <w:r>
+              <w:t xml:space="preserve"> </w:t>
+            </w:r>
+            <w:r>
+              <w:rPr>
+                <w:bCs/>
+                <w:b/>
+              </w:rPr>
+              <w:t xml:space="preserve">Membre de la délégation DL…</w:t>
+            </w:r>
+            <w:r>
+              <w:t xml:space="preserve"> </w:t>
+            </w:r>
+            <w:r>
+              <w:t xml:space="preserve">au-dessus des vérifications, avec la fonction, le type de passeport et, le cas échéant, l'autorisation collective d'entrée</w:t>
+            </w:r>
+          </w:p>
+        </w:tc>
+        <w:tc>
+          <w:tcPr/>
+          <w:p>
+            <w:pPr>
+              <w:pStyle w:val="Compact"/>
+              <w:jc w:val="left"/>
+            </w:pPr>
+            <w:r>
+              <w:t xml:space="preserve">Contrôlez et décidez comme pour tout voyageur : le bandeau ne dispense d'aucune vérification. Cliquez ensuite sur</w:t>
+            </w:r>
+            <w:r>
+              <w:t xml:space="preserve"> </w:t>
+            </w:r>
+            <w:r>
+              <w:rPr>
+                <w:bCs/>
+                <w:b/>
+              </w:rPr>
+              <w:t xml:space="preserve">Voir la délégation</w:t>
+            </w:r>
+            <w:r>
+              <w:t xml:space="preserve"> </w:t>
+            </w:r>
+            <w:r>
+              <w:t xml:space="preserve">puis sur</w:t>
+            </w:r>
+            <w:r>
+              <w:t xml:space="preserve"> </w:t>
+            </w:r>
+            <w:r>
+              <w:rPr>
+                <w:bCs/>
+                <w:b/>
+              </w:rPr>
+              <w:t xml:space="preserve">Pointer</w:t>
+            </w:r>
+            <w:r>
+              <w:t xml:space="preserve"> </w:t>
+            </w:r>
+            <w:r>
+              <w:t xml:space="preserve">sur la ligne du membre. Pour une délégation VIP, suivez les consignes d'accueil protocolaire du poste. Voir</w:t>
+            </w:r>
+            <w:r>
+              <w:t xml:space="preserve"> </w:t>
+            </w:r>
+            <w:r>
+              <w:rPr>
+                <w:iCs/>
+                <w:i/>
+              </w:rPr>
+              <w:t xml:space="preserve">Délégations : visites officielles, compétitions, conférences</w:t>
+            </w:r>
+            <w:r>
+              <w:t xml:space="preserve">.</w:t>
+            </w:r>
+          </w:p>
+        </w:tc>
+      </w:tr>
+      <w:tr>
+        <w:tc>
+          <w:tcPr/>
+          <w:p>
+            <w:pPr>
+              <w:pStyle w:val="Compact"/>
+              <w:jc w:val="left"/>
+            </w:pPr>
+            <w:r>
               <w:t xml:space="preserve">QR e-Visa refusé</w:t>
             </w:r>
           </w:p>
@@ -4405,7 +4533,7 @@
     </w:p>
     <w:bookmarkEnd w:id="32"/>
     <w:bookmarkEnd w:id="33"/>
-    <w:bookmarkStart w:id="38" w:name="analyste-renseignement"/>
+    <w:bookmarkStart w:id="39" w:name="analyste-renseignement"/>
     <w:p>
       <w:pPr>
         <w:pStyle w:val="Heading2"/>
@@ -4803,58 +4931,45 @@
           <w:bCs/>
           <w:b/>
         </w:rPr>
-        <w:t xml:space="preserve">Listes de surveillance</w:t>
-      </w:r>
-      <w:r>
-        <w:t xml:space="preserve"> </w:t>
-      </w:r>
-      <w:r>
-        <w:t xml:space="preserve">et</w:t>
-      </w:r>
-      <w:r>
-        <w:t xml:space="preserve"> </w:t>
-      </w:r>
-      <w:r>
-        <w:rPr>
-          <w:bCs/>
-          <w:b/>
-        </w:rPr>
-        <w:t xml:space="preserve">Règles de ciblage</w:t>
-      </w:r>
-      <w:r>
-        <w:t xml:space="preserve"> </w:t>
-      </w:r>
-      <w:r>
-        <w:t xml:space="preserve">: mettez à jour les entrées et règles selon les instructions reçues, en renseignant toujours la</w:t>
-      </w:r>
-      <w:r>
-        <w:t xml:space="preserve"> </w:t>
-      </w:r>
-      <w:r>
-        <w:rPr>
-          <w:bCs/>
-          <w:b/>
-        </w:rPr>
-        <w:t xml:space="preserve">Référence</w:t>
-      </w:r>
-      <w:r>
-        <w:t xml:space="preserve"> </w:t>
-      </w:r>
-      <w:r>
-        <w:t xml:space="preserve">et le</w:t>
-      </w:r>
-      <w:r>
-        <w:t xml:space="preserve"> </w:t>
-      </w:r>
-      <w:r>
-        <w:rPr>
-          <w:bCs/>
-          <w:b/>
-        </w:rPr>
-        <w:t xml:space="preserve">Motif</w:t>
-      </w:r>
-      <w:r>
-        <w:t xml:space="preserve">.</w:t>
+        <w:t xml:space="preserve">Délégations</w:t>
+      </w:r>
+      <w:r>
+        <w:t xml:space="preserve"> </w:t>
+      </w:r>
+      <w:r>
+        <w:t xml:space="preserve">: traitez les délégations</w:t>
+      </w:r>
+      <w:r>
+        <w:t xml:space="preserve"> </w:t>
+      </w:r>
+      <w:r>
+        <w:rPr>
+          <w:bCs/>
+          <w:b/>
+        </w:rPr>
+        <w:t xml:space="preserve">à valider</w:t>
+      </w:r>
+      <w:r>
+        <w:t xml:space="preserve"> </w:t>
+      </w:r>
+      <w:r>
+        <w:t xml:space="preserve">et les alertes</w:t>
+      </w:r>
+      <w:r>
+        <w:t xml:space="preserve"> </w:t>
+      </w:r>
+      <w:r>
+        <w:rPr>
+          <w:bCs/>
+          <w:b/>
+        </w:rPr>
+        <w:t xml:space="preserve">Délégation (pré-contrôle)</w:t>
+      </w:r>
+      <w:r>
+        <w:t xml:space="preserve"> </w:t>
+      </w:r>
+      <w:r>
+        <w:t xml:space="preserve">associées (voir ci-dessous).</w:t>
       </w:r>
     </w:p>
     <w:p>
@@ -4870,6 +4985,73 @@
           <w:bCs/>
           <w:b/>
         </w:rPr>
+        <w:t xml:space="preserve">Listes de surveillance</w:t>
+      </w:r>
+      <w:r>
+        <w:t xml:space="preserve"> </w:t>
+      </w:r>
+      <w:r>
+        <w:t xml:space="preserve">et</w:t>
+      </w:r>
+      <w:r>
+        <w:t xml:space="preserve"> </w:t>
+      </w:r>
+      <w:r>
+        <w:rPr>
+          <w:bCs/>
+          <w:b/>
+        </w:rPr>
+        <w:t xml:space="preserve">Règles de ciblage</w:t>
+      </w:r>
+      <w:r>
+        <w:t xml:space="preserve"> </w:t>
+      </w:r>
+      <w:r>
+        <w:t xml:space="preserve">: mettez à jour les entrées et règles selon les instructions reçues, en renseignant toujours la</w:t>
+      </w:r>
+      <w:r>
+        <w:t xml:space="preserve"> </w:t>
+      </w:r>
+      <w:r>
+        <w:rPr>
+          <w:bCs/>
+          <w:b/>
+        </w:rPr>
+        <w:t xml:space="preserve">Référence</w:t>
+      </w:r>
+      <w:r>
+        <w:t xml:space="preserve"> </w:t>
+      </w:r>
+      <w:r>
+        <w:t xml:space="preserve">et le</w:t>
+      </w:r>
+      <w:r>
+        <w:t xml:space="preserve"> </w:t>
+      </w:r>
+      <w:r>
+        <w:rPr>
+          <w:bCs/>
+          <w:b/>
+        </w:rPr>
+        <w:t xml:space="preserve">Motif</w:t>
+      </w:r>
+      <w:r>
+        <w:t xml:space="preserve">.</w:t>
+      </w:r>
+    </w:p>
+    <w:p>
+      <w:pPr>
+        <w:numPr>
+          <w:ilvl w:val="0"/>
+          <w:numId w:val="1008"/>
+        </w:numPr>
+        <w:pStyle w:val="Compact"/>
+      </w:pPr>
+      <w:r>
+        <w:rPr>
+          <w:bCs/>
+          <w:b/>
+        </w:rPr>
         <w:t xml:space="preserve">Connecteurs</w:t>
       </w:r>
       <w:r>
@@ -5095,7 +5277,273 @@
       </w:r>
     </w:p>
     <w:bookmarkEnd w:id="36"/>
-    <w:bookmarkStart w:id="37" w:name="situations-courantes-2"/>
+    <w:bookmarkStart w:id="37" w:name="instruire-une-délégation"/>
+    <w:p>
+      <w:pPr>
+        <w:pStyle w:val="Heading3"/>
+      </w:pPr>
+      <w:r>
+        <w:t xml:space="preserve">Instruire une délégation</w:t>
+      </w:r>
+    </w:p>
+    <w:p>
+      <w:pPr>
+        <w:numPr>
+          <w:ilvl w:val="0"/>
+          <w:numId w:val="1010"/>
+        </w:numPr>
+        <w:pStyle w:val="Compact"/>
+      </w:pPr>
+      <w:r>
+        <w:t xml:space="preserve">Ouvrez la tuile</w:t>
+      </w:r>
+      <w:r>
+        <w:t xml:space="preserve"> </w:t>
+      </w:r>
+      <w:r>
+        <w:rPr>
+          <w:bCs/>
+          <w:b/>
+        </w:rPr>
+        <w:t xml:space="preserve">Délégations</w:t>
+      </w:r>
+      <w:r>
+        <w:t xml:space="preserve"> </w:t>
+      </w:r>
+      <w:r>
+        <w:t xml:space="preserve">et filtrez sur le statut</w:t>
+      </w:r>
+      <w:r>
+        <w:t xml:space="preserve"> </w:t>
+      </w:r>
+      <w:r>
+        <w:rPr>
+          <w:bCs/>
+          <w:b/>
+        </w:rPr>
+        <w:t xml:space="preserve">Soumise</w:t>
+      </w:r>
+      <w:r>
+        <w:t xml:space="preserve"> </w:t>
+      </w:r>
+      <w:r>
+        <w:t xml:space="preserve">(ou utilisez</w:t>
+      </w:r>
+      <w:r>
+        <w:t xml:space="preserve"> </w:t>
+      </w:r>
+      <w:r>
+        <w:rPr>
+          <w:bCs/>
+          <w:b/>
+        </w:rPr>
+        <w:t xml:space="preserve">Enregistrer une délégation</w:t>
+      </w:r>
+      <w:r>
+        <w:t xml:space="preserve"> </w:t>
+      </w:r>
+      <w:r>
+        <w:t xml:space="preserve">pour saisir vous-même une délégation annoncée par un ministère ou une ambassade).</w:t>
+      </w:r>
+    </w:p>
+    <w:p>
+      <w:pPr>
+        <w:numPr>
+          <w:ilvl w:val="0"/>
+          <w:numId w:val="1010"/>
+        </w:numPr>
+        <w:pStyle w:val="Compact"/>
+      </w:pPr>
+      <w:r>
+        <w:t xml:space="preserve">Ouvrez la fiche : vérifiez les dates, le point d'entrée, la liste des membres et la colonne</w:t>
+      </w:r>
+      <w:r>
+        <w:t xml:space="preserve"> </w:t>
+      </w:r>
+      <w:r>
+        <w:rPr>
+          <w:bCs/>
+          <w:b/>
+        </w:rPr>
+        <w:t xml:space="preserve">Pré-contrôle</w:t>
+      </w:r>
+      <w:r>
+        <w:t xml:space="preserve">.</w:t>
+      </w:r>
+    </w:p>
+    <w:p>
+      <w:pPr>
+        <w:numPr>
+          <w:ilvl w:val="0"/>
+          <w:numId w:val="1010"/>
+        </w:numPr>
+        <w:pStyle w:val="Compact"/>
+      </w:pPr>
+      <w:r>
+        <w:t xml:space="preserve">Pour chaque membre signalé (score de 60 ou plus), traitez l'alerte</w:t>
+      </w:r>
+      <w:r>
+        <w:t xml:space="preserve"> </w:t>
+      </w:r>
+      <w:r>
+        <w:rPr>
+          <w:bCs/>
+          <w:b/>
+        </w:rPr>
+        <w:t xml:space="preserve">Délégation (pré-contrôle)</w:t>
+      </w:r>
+      <w:r>
+        <w:t xml:space="preserve"> </w:t>
+      </w:r>
+      <w:r>
+        <w:t xml:space="preserve">du Threat Monitor ; si le signalement est confirmé, retirez le membre (corbeille) ou refusez la délégation.</w:t>
+      </w:r>
+    </w:p>
+    <w:p>
+      <w:pPr>
+        <w:numPr>
+          <w:ilvl w:val="0"/>
+          <w:numId w:val="1010"/>
+        </w:numPr>
+        <w:pStyle w:val="Compact"/>
+      </w:pPr>
+      <w:r>
+        <w:t xml:space="preserve">Ajoutez si besoin les membres annoncés tardivement avec</w:t>
+      </w:r>
+      <w:r>
+        <w:t xml:space="preserve"> </w:t>
+      </w:r>
+      <w:r>
+        <w:rPr>
+          <w:bCs/>
+          <w:b/>
+        </w:rPr>
+        <w:t xml:space="preserve">Ajouter des membres</w:t>
+      </w:r>
+      <w:r>
+        <w:t xml:space="preserve"> </w:t>
+      </w:r>
+      <w:r>
+        <w:t xml:space="preserve">(format</w:t>
+      </w:r>
+      <w:r>
+        <w:t xml:space="preserve"> </w:t>
+      </w:r>
+      <w:r>
+        <w:rPr>
+          <w:rStyle w:val="VerbatimChar"/>
+        </w:rPr>
+        <w:t xml:space="preserve">Nom;Prénoms;Nationalité;Sexe;Naissance;Passeport;Fonction;Type de passeport</w:t>
+      </w:r>
+      <w:r>
+        <w:t xml:space="preserve">).</w:t>
+      </w:r>
+    </w:p>
+    <w:p>
+      <w:pPr>
+        <w:numPr>
+          <w:ilvl w:val="0"/>
+          <w:numId w:val="1010"/>
+        </w:numPr>
+        <w:pStyle w:val="Compact"/>
+      </w:pPr>
+      <w:r>
+        <w:t xml:space="preserve">Cliquez sur</w:t>
+      </w:r>
+      <w:r>
+        <w:t xml:space="preserve"> </w:t>
+      </w:r>
+      <w:r>
+        <w:rPr>
+          <w:bCs/>
+          <w:b/>
+        </w:rPr>
+        <w:t xml:space="preserve">Valider</w:t>
+      </w:r>
+      <w:r>
+        <w:t xml:space="preserve"> </w:t>
+      </w:r>
+      <w:r>
+        <w:t xml:space="preserve">en laissant cochée l'</w:t>
+      </w:r>
+      <w:r>
+        <w:rPr>
+          <w:bCs/>
+          <w:b/>
+        </w:rPr>
+        <w:t xml:space="preserve">autorisation collective d'entrée</w:t>
+      </w:r>
+      <w:r>
+        <w:t xml:space="preserve"> </w:t>
+      </w:r>
+      <w:r>
+        <w:t xml:space="preserve">(elle vaut e-Visa pour chaque membre de 3 jours avant l'arrivée à 3 jours après le départ) ou en la décochant (e-Visa individuels requis), ou sur</w:t>
+      </w:r>
+      <w:r>
+        <w:t xml:space="preserve"> </w:t>
+      </w:r>
+      <w:r>
+        <w:rPr>
+          <w:bCs/>
+          <w:b/>
+        </w:rPr>
+        <w:t xml:space="preserve">Refuser</w:t>
+      </w:r>
+      <w:r>
+        <w:t xml:space="preserve"> </w:t>
+      </w:r>
+      <w:r>
+        <w:t xml:space="preserve">avec un motif, affiché à l'organisateur.</w:t>
+      </w:r>
+    </w:p>
+    <w:p>
+      <w:pPr>
+        <w:numPr>
+          <w:ilvl w:val="0"/>
+          <w:numId w:val="1010"/>
+        </w:numPr>
+        <w:pStyle w:val="Compact"/>
+      </w:pPr>
+      <w:r>
+        <w:t xml:space="preserve">Après le départ du groupe, cliquez sur</w:t>
+      </w:r>
+      <w:r>
+        <w:t xml:space="preserve"> </w:t>
+      </w:r>
+      <w:r>
+        <w:rPr>
+          <w:bCs/>
+          <w:b/>
+        </w:rPr>
+        <w:t xml:space="preserve">Clôturer</w:t>
+      </w:r>
+      <w:r>
+        <w:t xml:space="preserve">.</w:t>
+      </w:r>
+    </w:p>
+    <w:p>
+      <w:pPr>
+        <w:pStyle w:val="FirstParagraph"/>
+      </w:pPr>
+      <w:r>
+        <w:t xml:space="preserve">Ne communiquez jamais le résultat du pré-contrôle à l'organisateur. Voir</w:t>
+      </w:r>
+      <w:r>
+        <w:t xml:space="preserve"> </w:t>
+      </w:r>
+      <w:r>
+        <w:rPr>
+          <w:iCs/>
+          <w:i/>
+        </w:rPr>
+        <w:t xml:space="preserve">Délégations : visites officielles, compétitions, conférences</w:t>
+      </w:r>
+      <w:r>
+        <w:t xml:space="preserve">.</w:t>
+      </w:r>
+    </w:p>
+    <w:bookmarkEnd w:id="37"/>
+    <w:bookmarkStart w:id="38" w:name="situations-courantes-2"/>
     <w:p>
       <w:pPr>
         <w:pStyle w:val="Heading3"/>
@@ -5244,6 +5692,61 @@
               <w:jc w:val="left"/>
             </w:pPr>
             <w:r>
+              <w:t xml:space="preserve">Membre de délégation signalé au pré-contrôle</w:t>
+            </w:r>
+          </w:p>
+        </w:tc>
+        <w:tc>
+          <w:tcPr/>
+          <w:p>
+            <w:pPr>
+              <w:pStyle w:val="Compact"/>
+              <w:jc w:val="left"/>
+            </w:pPr>
+            <w:r>
+              <w:t xml:space="preserve">Traitez l'alerte</w:t>
+            </w:r>
+            <w:r>
+              <w:t xml:space="preserve"> </w:t>
+            </w:r>
+            <w:r>
+              <w:rPr>
+                <w:bCs/>
+                <w:b/>
+              </w:rPr>
+              <w:t xml:space="preserve">Délégation (pré-contrôle)</w:t>
+            </w:r>
+            <w:r>
+              <w:t xml:space="preserve"> </w:t>
+            </w:r>
+            <w:r>
+              <w:t xml:space="preserve">comme toute alerte. Homonyme : clôturez avec « Fausse alerte — homonyme ». Signalement confirmé : retirez le membre tant que la délégation est</w:t>
+            </w:r>
+            <w:r>
+              <w:t xml:space="preserve"> </w:t>
+            </w:r>
+            <w:r>
+              <w:rPr>
+                <w:bCs/>
+                <w:b/>
+              </w:rPr>
+              <w:t xml:space="preserve">Soumise</w:t>
+            </w:r>
+            <w:r>
+              <w:t xml:space="preserve">, ou refusez-la, et prévenez le chef de poste du point d'entrée.</w:t>
+            </w:r>
+          </w:p>
+        </w:tc>
+      </w:tr>
+      <w:tr>
+        <w:tc>
+          <w:tcPr/>
+          <w:p>
+            <w:pPr>
+              <w:pStyle w:val="Compact"/>
+              <w:jc w:val="left"/>
+            </w:pPr>
+            <w:r>
               <w:t xml:space="preserve">Demande d'information sans réponse</w:t>
             </w:r>
           </w:p>
@@ -5471,9 +5974,9 @@
         </w:tc>
       </w:tr>
     </w:tbl>
-    <w:bookmarkEnd w:id="37"/>
     <w:bookmarkEnd w:id="38"/>
-    <w:bookmarkStart w:id="42" w:name="superviseur-de-poste-chef-de-vacation"/>
+    <w:bookmarkEnd w:id="39"/>
+    <w:bookmarkStart w:id="43" w:name="superviseur-de-poste-chef-de-vacation"/>
     <w:p>
       <w:pPr>
         <w:pStyle w:val="Heading2"/>
@@ -5482,7 +5985,7 @@
         <w:t xml:space="preserve">Superviseur de poste (chef de vacation)</w:t>
       </w:r>
     </w:p>
-    <w:bookmarkStart w:id="39" w:name="ce-que-vous-voyez-3"/>
+    <w:bookmarkStart w:id="40" w:name="ce-que-vous-voyez-3"/>
     <w:p>
       <w:pPr>
         <w:pStyle w:val="Heading3"/>
@@ -5515,8 +6018,8 @@
         <w:t xml:space="preserve">cumule les droits de l'agent et de l'analyste et le pilotage des eGates. Il ne donne pas accès à la gestion des utilisateurs, aux paramètres système ni au module finances.</w:t>
       </w:r>
     </w:p>
-    <w:bookmarkEnd w:id="39"/>
-    <w:bookmarkStart w:id="40" w:name="procédure-de-vacation"/>
+    <w:bookmarkEnd w:id="40"/>
+    <w:bookmarkStart w:id="41" w:name="procédure-de-vacation"/>
     <w:p>
       <w:pPr>
         <w:pStyle w:val="Heading3"/>
@@ -5529,7 +6032,7 @@
       <w:pPr>
         <w:numPr>
           <w:ilvl w:val="0"/>
-          <w:numId w:val="1010"/>
+          <w:numId w:val="1011"/>
         </w:numPr>
         <w:pStyle w:val="Compact"/>
       </w:pPr>
@@ -5599,7 +6102,7 @@
       <w:pPr>
         <w:numPr>
           <w:ilvl w:val="0"/>
-          <w:numId w:val="1010"/>
+          <w:numId w:val="1011"/>
         </w:numPr>
         <w:pStyle w:val="Compact"/>
       </w:pPr>
@@ -5611,19 +6114,48 @@
       <w:pPr>
         <w:numPr>
           <w:ilvl w:val="0"/>
-          <w:numId w:val="1010"/>
+          <w:numId w:val="1011"/>
         </w:numPr>
         <w:pStyle w:val="Compact"/>
       </w:pPr>
       <w:r>
-        <w:t xml:space="preserve">Diffusez aux agents la liste des passagers signalés des vols attendus (préparée par l'analyste).</w:t>
+        <w:t xml:space="preserve">Diffusez aux agents la liste des passagers signalés des vols attendus (préparée par l'analyste) et la liste des délégations attendues sur votre poste (tuile</w:t>
+      </w:r>
+      <w:r>
+        <w:t xml:space="preserve"> </w:t>
+      </w:r>
+      <w:r>
+        <w:rPr>
+          <w:bCs/>
+          <w:b/>
+        </w:rPr>
+        <w:t xml:space="preserve">Délégations</w:t>
+      </w:r>
+      <w:r>
+        <w:t xml:space="preserve">, bouton</w:t>
+      </w:r>
+      <w:r>
+        <w:t xml:space="preserve"> </w:t>
+      </w:r>
+      <w:r>
+        <w:rPr>
+          <w:bCs/>
+          <w:b/>
+        </w:rPr>
+        <w:t xml:space="preserve">Imprimer la liste</w:t>
+      </w:r>
+      <w:r>
+        <w:t xml:space="preserve"> </w:t>
+      </w:r>
+      <w:r>
+        <w:t xml:space="preserve">sur chaque fiche). Désignez si besoin un guichet dédié pour les délégations nombreuses ou VIP.</w:t>
       </w:r>
     </w:p>
     <w:p>
       <w:pPr>
         <w:numPr>
           <w:ilvl w:val="0"/>
-          <w:numId w:val="1010"/>
+          <w:numId w:val="1011"/>
         </w:numPr>
         <w:pStyle w:val="Compact"/>
       </w:pPr>
@@ -5642,7 +6174,7 @@
       <w:pPr>
         <w:numPr>
           <w:ilvl w:val="0"/>
-          <w:numId w:val="1010"/>
+          <w:numId w:val="1011"/>
         </w:numPr>
         <w:pStyle w:val="Compact"/>
       </w:pPr>
@@ -5683,7 +6215,7 @@
       <w:pPr>
         <w:numPr>
           <w:ilvl w:val="0"/>
-          <w:numId w:val="1010"/>
+          <w:numId w:val="1011"/>
         </w:numPr>
         <w:pStyle w:val="Compact"/>
       </w:pPr>
@@ -5705,7 +6237,7 @@
       <w:pPr>
         <w:numPr>
           <w:ilvl w:val="0"/>
-          <w:numId w:val="1010"/>
+          <w:numId w:val="1011"/>
         </w:numPr>
         <w:pStyle w:val="Compact"/>
       </w:pPr>
@@ -5752,8 +6284,8 @@
         <w:t xml:space="preserve">et reportez le début de l'empreinte de tête dans le rapport de vacation.</w:t>
       </w:r>
     </w:p>
-    <w:bookmarkEnd w:id="40"/>
-    <w:bookmarkStart w:id="41" w:name="situations-courantes-3"/>
+    <w:bookmarkEnd w:id="41"/>
+    <w:bookmarkStart w:id="42" w:name="situations-courantes-3"/>
     <w:p>
       <w:pPr>
         <w:pStyle w:val="Heading3"/>
@@ -5907,9 +6439,9 @@
         </w:tc>
       </w:tr>
     </w:tbl>
-    <w:bookmarkEnd w:id="41"/>
     <w:bookmarkEnd w:id="42"/>
-    <w:bookmarkStart w:id="46" w:name="administrateur"/>
+    <w:bookmarkEnd w:id="43"/>
+    <w:bookmarkStart w:id="47" w:name="administrateur"/>
     <w:p>
       <w:pPr>
         <w:pStyle w:val="Heading2"/>
@@ -5918,7 +6450,7 @@
         <w:t xml:space="preserve">Administrateur</w:t>
       </w:r>
     </w:p>
-    <w:bookmarkStart w:id="43" w:name="ce-que-vous-voyez-4"/>
+    <w:bookmarkStart w:id="44" w:name="ce-que-vous-voyez-4"/>
     <w:p>
       <w:pPr>
         <w:pStyle w:val="Heading3"/>
@@ -5992,8 +6524,8 @@
         <w:t xml:space="preserve">) et le module finances.</w:t>
       </w:r>
     </w:p>
-    <w:bookmarkEnd w:id="43"/>
-    <w:bookmarkStart w:id="44" w:name="tâches-courantes"/>
+    <w:bookmarkEnd w:id="44"/>
+    <w:bookmarkStart w:id="45" w:name="tâches-courantes"/>
     <w:p>
       <w:pPr>
         <w:pStyle w:val="Heading3"/>
@@ -6006,7 +6538,7 @@
       <w:pPr>
         <w:numPr>
           <w:ilvl w:val="0"/>
-          <w:numId w:val="1011"/>
+          <w:numId w:val="1012"/>
         </w:numPr>
         <w:pStyle w:val="Compact"/>
       </w:pPr>
@@ -6041,7 +6573,7 @@
       <w:pPr>
         <w:numPr>
           <w:ilvl w:val="0"/>
-          <w:numId w:val="1011"/>
+          <w:numId w:val="1012"/>
         </w:numPr>
         <w:pStyle w:val="Compact"/>
       </w:pPr>
@@ -6089,7 +6621,7 @@
       <w:pPr>
         <w:numPr>
           <w:ilvl w:val="0"/>
-          <w:numId w:val="1011"/>
+          <w:numId w:val="1012"/>
         </w:numPr>
         <w:pStyle w:val="Compact"/>
       </w:pPr>
@@ -6124,7 +6656,7 @@
       <w:pPr>
         <w:numPr>
           <w:ilvl w:val="0"/>
-          <w:numId w:val="1011"/>
+          <w:numId w:val="1012"/>
         </w:numPr>
         <w:pStyle w:val="Compact"/>
       </w:pPr>
@@ -6197,7 +6729,7 @@
       <w:pPr>
         <w:numPr>
           <w:ilvl w:val="0"/>
-          <w:numId w:val="1011"/>
+          <w:numId w:val="1012"/>
         </w:numPr>
         <w:pStyle w:val="Compact"/>
       </w:pPr>
@@ -6245,7 +6777,7 @@
       <w:pPr>
         <w:numPr>
           <w:ilvl w:val="0"/>
-          <w:numId w:val="1011"/>
+          <w:numId w:val="1012"/>
         </w:numPr>
         <w:pStyle w:val="Compact"/>
       </w:pPr>
@@ -6283,7 +6815,7 @@
       <w:pPr>
         <w:numPr>
           <w:ilvl w:val="0"/>
-          <w:numId w:val="1011"/>
+          <w:numId w:val="1012"/>
         </w:numPr>
         <w:pStyle w:val="Compact"/>
       </w:pPr>
@@ -6301,8 +6833,8 @@
         <w:t xml:space="preserve">: au moins à chaque mouvement de personnel, vérifiez que chaque compte actif correspond à un agent en fonction et au bon rôle.</w:t>
       </w:r>
     </w:p>
-    <w:bookmarkEnd w:id="44"/>
-    <w:bookmarkStart w:id="45" w:name="situations-courantes-4"/>
+    <w:bookmarkEnd w:id="45"/>
+    <w:bookmarkStart w:id="46" w:name="situations-courantes-4"/>
     <w:p>
       <w:pPr>
         <w:pStyle w:val="Heading3"/>
@@ -6508,9 +7040,9 @@
         </w:tc>
       </w:tr>
     </w:tbl>
-    <w:bookmarkEnd w:id="45"/>
     <w:bookmarkEnd w:id="46"/>
-    <w:bookmarkStart w:id="51" w:name="agent-du-trésor-redevance-de-sécurité"/>
+    <w:bookmarkEnd w:id="47"/>
+    <w:bookmarkStart w:id="52" w:name="agent-du-trésor-redevance-de-sécurité"/>
     <w:p>
       <w:pPr>
         <w:pStyle w:val="Heading2"/>
@@ -6519,7 +7051,7 @@
         <w:t xml:space="preserve">Agent du Trésor (redevance de sécurité)</w:t>
       </w:r>
     </w:p>
-    <w:bookmarkStart w:id="47" w:name="ce-que-vous-voyez-5"/>
+    <w:bookmarkStart w:id="48" w:name="ce-que-vous-voyez-5"/>
     <w:p>
       <w:pPr>
         <w:pStyle w:val="Heading3"/>
@@ -6686,8 +7218,8 @@
         <w:t xml:space="preserve">, « Circuit de recouvrement ».</w:t>
       </w:r>
     </w:p>
-    <w:bookmarkEnd w:id="47"/>
-    <w:bookmarkStart w:id="48" w:name="calendrier-mensuel"/>
+    <w:bookmarkEnd w:id="48"/>
+    <w:bookmarkStart w:id="49" w:name="calendrier-mensuel"/>
     <w:p>
       <w:pPr>
         <w:pStyle w:val="Heading3"/>
@@ -6702,324 +7234,6 @@
       </w:pPr>
       <w:r>
         <w:t xml:space="preserve">Le calendrier suit l'arrêté interministériel du 3 février 2012 ; les étapes de paiement dépendent du circuit de recouvrement :</w:t>
-      </w:r>
-    </w:p>
-    <w:p>
-      <w:pPr>
-        <w:numPr>
-          <w:ilvl w:val="0"/>
-          <w:numId w:val="1012"/>
-        </w:numPr>
-        <w:pStyle w:val="Compact"/>
-      </w:pPr>
-      <w:r>
-        <w:rPr>
-          <w:bCs/>
-          <w:b/>
-        </w:rPr>
-        <w:t xml:space="preserve">Du 1er au 9 du mois M+1</w:t>
-      </w:r>
-      <w:r>
-        <w:t xml:space="preserve"> </w:t>
-      </w:r>
-      <w:r>
-        <w:t xml:space="preserve">: collecte des statistiques (déclarations des compagnies et comptage WawID). Consultez</w:t>
-      </w:r>
-      <w:r>
-        <w:t xml:space="preserve"> </w:t>
-      </w:r>
-      <w:r>
-        <w:rPr>
-          <w:bCs/>
-          <w:b/>
-        </w:rPr>
-        <w:t xml:space="preserve">Assiette du mois en cours (WawID)</w:t>
-      </w:r>
-      <w:r>
-        <w:t xml:space="preserve"> </w:t>
-      </w:r>
-      <w:r>
-        <w:t xml:space="preserve">pour une première estimation.</w:t>
-      </w:r>
-    </w:p>
-    <w:p>
-      <w:pPr>
-        <w:numPr>
-          <w:ilvl w:val="0"/>
-          <w:numId w:val="1012"/>
-        </w:numPr>
-        <w:pStyle w:val="Compact"/>
-      </w:pPr>
-      <w:r>
-        <w:rPr>
-          <w:bCs/>
-          <w:b/>
-        </w:rPr>
-        <w:t xml:space="preserve">Le 10 du mois M+1</w:t>
-      </w:r>
-      <w:r>
-        <w:t xml:space="preserve"> </w:t>
-      </w:r>
-      <w:r>
-        <w:t xml:space="preserve">: émission des factures en FCFA au taux IATA du mois M. Vérifiez dans</w:t>
-      </w:r>
-      <w:r>
-        <w:t xml:space="preserve"> </w:t>
-      </w:r>
-      <w:r>
-        <w:rPr>
-          <w:bCs/>
-          <w:b/>
-        </w:rPr>
-        <w:t xml:space="preserve">Factures compagnies</w:t>
-      </w:r>
-      <w:r>
-        <w:t xml:space="preserve"> </w:t>
-      </w:r>
-      <w:r>
-        <w:t xml:space="preserve">que chaque compagnie a sa facture</w:t>
-      </w:r>
-      <w:r>
-        <w:t xml:space="preserve"> </w:t>
-      </w:r>
-      <w:r>
-        <w:rPr>
-          <w:rStyle w:val="VerbatimChar"/>
-        </w:rPr>
-        <w:t xml:space="preserve">RS-AAAAMM-XX</w:t>
-      </w:r>
-      <w:r>
-        <w:t xml:space="preserve">.</w:t>
-      </w:r>
-    </w:p>
-    <w:p>
-      <w:pPr>
-        <w:numPr>
-          <w:ilvl w:val="0"/>
-          <w:numId w:val="1012"/>
-        </w:numPr>
-        <w:pStyle w:val="Compact"/>
-      </w:pPr>
-      <w:r>
-        <w:rPr>
-          <w:bCs/>
-          <w:b/>
-        </w:rPr>
-        <w:t xml:space="preserve">Pendant le mois M+1</w:t>
-      </w:r>
-      <w:r>
-        <w:t xml:space="preserve"> </w:t>
-      </w:r>
-      <w:r>
-        <w:t xml:space="preserve">: les compagnies déclarent leurs virements sur leur plateforme ; dans</w:t>
-      </w:r>
-      <w:r>
-        <w:t xml:space="preserve"> </w:t>
-      </w:r>
-      <w:r>
-        <w:rPr>
-          <w:bCs/>
-          <w:b/>
-        </w:rPr>
-        <w:t xml:space="preserve">Paiements à valider</w:t>
-      </w:r>
-      <w:r>
-        <w:t xml:space="preserve">, rapprochez chaque déclaration du relevé du compte de collecte, puis</w:t>
-      </w:r>
-      <w:r>
-        <w:t xml:space="preserve"> </w:t>
-      </w:r>
-      <w:r>
-        <w:rPr>
-          <w:bCs/>
-          <w:b/>
-        </w:rPr>
-        <w:t xml:space="preserve">Valider</w:t>
-      </w:r>
-      <w:r>
-        <w:t xml:space="preserve"> </w:t>
-      </w:r>
-      <w:r>
-        <w:t xml:space="preserve">ou</w:t>
-      </w:r>
-      <w:r>
-        <w:t xml:space="preserve"> </w:t>
-      </w:r>
-      <w:r>
-        <w:rPr>
-          <w:bCs/>
-          <w:b/>
-        </w:rPr>
-        <w:t xml:space="preserve">Rejeter</w:t>
-      </w:r>
-      <w:r>
-        <w:t xml:space="preserve"> </w:t>
-      </w:r>
-      <w:r>
-        <w:t xml:space="preserve">(avec un motif). Dans le circuit</w:t>
-      </w:r>
-      <w:r>
-        <w:t xml:space="preserve"> </w:t>
-      </w:r>
-      <w:r>
-        <w:rPr>
-          <w:rStyle w:val="VerbatimChar"/>
-        </w:rPr>
-        <w:t xml:space="preserve">TRESOR</w:t>
-      </w:r>
-      <w:r>
-        <w:t xml:space="preserve">, enregistrez aussi l'encaissement à réception de chaque quittance du Receveur général du Trésor.</w:t>
-      </w:r>
-    </w:p>
-    <w:p>
-      <w:pPr>
-        <w:numPr>
-          <w:ilvl w:val="0"/>
-          <w:numId w:val="1012"/>
-        </w:numPr>
-        <w:pStyle w:val="Compact"/>
-      </w:pPr>
-      <w:r>
-        <w:rPr>
-          <w:bCs/>
-          <w:b/>
-        </w:rPr>
-        <w:t xml:space="preserve">Fin du mois M+1</w:t>
-      </w:r>
-      <w:r>
-        <w:t xml:space="preserve"> </w:t>
-      </w:r>
-      <w:r>
-        <w:t xml:space="preserve">: échéance. Les factures non soldées par des paiements validés passent</w:t>
-      </w:r>
-      <w:r>
-        <w:t xml:space="preserve"> </w:t>
-      </w:r>
-      <w:r>
-        <w:rPr>
-          <w:bCs/>
-          <w:b/>
-        </w:rPr>
-        <w:t xml:space="preserve">EN RETARD</w:t>
-      </w:r>
-      <w:r>
-        <w:t xml:space="preserve"> </w:t>
-      </w:r>
-      <w:r>
-        <w:t xml:space="preserve">; la pénalité de 5 % par mois de retard s'applique au reste dû.</w:t>
-      </w:r>
-    </w:p>
-    <w:p>
-      <w:pPr>
-        <w:numPr>
-          <w:ilvl w:val="0"/>
-          <w:numId w:val="1012"/>
-        </w:numPr>
-        <w:pStyle w:val="Compact"/>
-      </w:pPr>
-      <w:r>
-        <w:rPr>
-          <w:bCs/>
-          <w:b/>
-        </w:rPr>
-        <w:t xml:space="preserve">Le 15 du mois M+2</w:t>
-      </w:r>
-      <w:r>
-        <w:t xml:space="preserve"> </w:t>
-      </w:r>
-      <w:r>
-        <w:t xml:space="preserve">(circuit</w:t>
-      </w:r>
-      <w:r>
-        <w:t xml:space="preserve"> </w:t>
-      </w:r>
-      <w:r>
-        <w:rPr>
-          <w:rStyle w:val="VerbatimChar"/>
-        </w:rPr>
-        <w:t xml:space="preserve">OPERATEUR</w:t>
-      </w:r>
-      <w:r>
-        <w:t xml:space="preserve">) : dans</w:t>
-      </w:r>
-      <w:r>
-        <w:t xml:space="preserve"> </w:t>
-      </w:r>
-      <w:r>
-        <w:rPr>
-          <w:bCs/>
-          <w:b/>
-        </w:rPr>
-        <w:t xml:space="preserve">Reversements à l'État</w:t>
-      </w:r>
-      <w:r>
-        <w:t xml:space="preserve">, enregistrez le virement de la part de l'État au Receveur général du Trésor avec sa référence.</w:t>
-      </w:r>
-    </w:p>
-    <w:p>
-      <w:pPr>
-        <w:numPr>
-          <w:ilvl w:val="0"/>
-          <w:numId w:val="1012"/>
-        </w:numPr>
-        <w:pStyle w:val="Compact"/>
-      </w:pPr>
-      <w:r>
-        <w:rPr>
-          <w:bCs/>
-          <w:b/>
-        </w:rPr>
-        <w:t xml:space="preserve">Chaque mois</w:t>
-      </w:r>
-      <w:r>
-        <w:t xml:space="preserve"> </w:t>
-      </w:r>
-      <w:r>
-        <w:t xml:space="preserve">: examinez l'onglet</w:t>
-      </w:r>
-      <w:r>
-        <w:t xml:space="preserve"> </w:t>
-      </w:r>
-      <w:r>
-        <w:rPr>
-          <w:bCs/>
-          <w:b/>
-        </w:rPr>
-        <w:t xml:space="preserve">Rapprochement</w:t>
-      </w:r>
-      <w:r>
-        <w:t xml:space="preserve"> </w:t>
-      </w:r>
-      <w:r>
-        <w:t xml:space="preserve">et exportez les données (</w:t>
-      </w:r>
-      <w:r>
-        <w:rPr>
-          <w:bCs/>
-          <w:b/>
-        </w:rPr>
-        <w:t xml:space="preserve">Exporter</w:t>
-      </w:r>
-      <w:r>
-        <w:t xml:space="preserve">) pour la comptabilité publique.</w:t>
-      </w:r>
-    </w:p>
-    <w:bookmarkEnd w:id="48"/>
-    <w:bookmarkStart w:id="49" w:name="enregistrer-un-encaissement"/>
-    <w:p>
-      <w:pPr>
-        <w:pStyle w:val="Heading3"/>
-      </w:pPr>
-      <w:r>
-        <w:t xml:space="preserve">Enregistrer un encaissement</w:t>
-      </w:r>
-    </w:p>
-    <w:p>
-      <w:pPr>
-        <w:pStyle w:val="FirstParagraph"/>
-      </w:pPr>
-      <w:r>
-        <w:t xml:space="preserve">Pour un paiement que la compagnie n'a pas déclaré sur sa plateforme :</w:t>
       </w:r>
     </w:p>
     <w:p>
@@ -7031,23 +7245,33 @@
         <w:pStyle w:val="Compact"/>
       </w:pPr>
       <w:r>
-        <w:t xml:space="preserve">Ouvrez</w:t>
-      </w:r>
-      <w:r>
-        <w:t xml:space="preserve"> </w:t>
-      </w:r>
-      <w:r>
-        <w:rPr>
-          <w:bCs/>
-          <w:b/>
-        </w:rPr>
-        <w:t xml:space="preserve">Factures compagnies</w:t>
-      </w:r>
-      <w:r>
-        <w:t xml:space="preserve"> </w:t>
-      </w:r>
-      <w:r>
-        <w:t xml:space="preserve">et cliquez sur la facture.</w:t>
+        <w:rPr>
+          <w:bCs/>
+          <w:b/>
+        </w:rPr>
+        <w:t xml:space="preserve">Du 1er au 9 du mois M+1</w:t>
+      </w:r>
+      <w:r>
+        <w:t xml:space="preserve"> </w:t>
+      </w:r>
+      <w:r>
+        <w:t xml:space="preserve">: collecte des statistiques (déclarations des compagnies et comptage WawID). Consultez</w:t>
+      </w:r>
+      <w:r>
+        <w:t xml:space="preserve"> </w:t>
+      </w:r>
+      <w:r>
+        <w:rPr>
+          <w:bCs/>
+          <w:b/>
+        </w:rPr>
+        <w:t xml:space="preserve">Assiette du mois en cours (WawID)</w:t>
+      </w:r>
+      <w:r>
+        <w:t xml:space="preserve"> </w:t>
+      </w:r>
+      <w:r>
+        <w:t xml:space="preserve">pour une première estimation.</w:t>
       </w:r>
     </w:p>
     <w:p>
@@ -7059,39 +7283,45 @@
         <w:pStyle w:val="Compact"/>
       </w:pPr>
       <w:r>
-        <w:t xml:space="preserve">Dans</w:t>
-      </w:r>
-      <w:r>
-        <w:t xml:space="preserve"> </w:t>
-      </w:r>
-      <w:r>
-        <w:rPr>
-          <w:bCs/>
-          <w:b/>
-        </w:rPr>
-        <w:t xml:space="preserve">Enregistrer un encaissement (relevé du compte de collecte)</w:t>
-      </w:r>
-      <w:r>
-        <w:t xml:space="preserve"> </w:t>
-      </w:r>
-      <w:r>
-        <w:t xml:space="preserve">ou</w:t>
-      </w:r>
-      <w:r>
-        <w:t xml:space="preserve"> </w:t>
-      </w:r>
-      <w:r>
-        <w:rPr>
-          <w:bCs/>
-          <w:b/>
-        </w:rPr>
-        <w:t xml:space="preserve">Enregistrer un encaissement (quittance du Trésor)</w:t>
-      </w:r>
-      <w:r>
-        <w:t xml:space="preserve"> </w:t>
-      </w:r>
-      <w:r>
-        <w:t xml:space="preserve">selon le circuit, vérifiez le montant (prérempli avec le reste dû et les pénalités) et corrigez-le si le relevé ou la quittance porte un autre montant.</w:t>
+        <w:rPr>
+          <w:bCs/>
+          <w:b/>
+        </w:rPr>
+        <w:t xml:space="preserve">Le 10 du mois M+1</w:t>
+      </w:r>
+      <w:r>
+        <w:t xml:space="preserve"> </w:t>
+      </w:r>
+      <w:r>
+        <w:t xml:space="preserve">: émission des factures en FCFA au taux IATA du mois M. Vérifiez dans</w:t>
+      </w:r>
+      <w:r>
+        <w:t xml:space="preserve"> </w:t>
+      </w:r>
+      <w:r>
+        <w:rPr>
+          <w:bCs/>
+          <w:b/>
+        </w:rPr>
+        <w:t xml:space="preserve">Factures compagnies</w:t>
+      </w:r>
+      <w:r>
+        <w:t xml:space="preserve"> </w:t>
+      </w:r>
+      <w:r>
+        <w:t xml:space="preserve">que chaque compagnie a sa facture</w:t>
+      </w:r>
+      <w:r>
+        <w:t xml:space="preserve"> </w:t>
+      </w:r>
+      <w:r>
+        <w:rPr>
+          <w:rStyle w:val="VerbatimChar"/>
+        </w:rPr>
+        <w:t xml:space="preserve">RS-AAAAMM-XX</w:t>
+      </w:r>
+      <w:r>
+        <w:t xml:space="preserve">.</w:t>
       </w:r>
     </w:p>
     <w:p>
@@ -7103,23 +7333,74 @@
         <w:pStyle w:val="Compact"/>
       </w:pPr>
       <w:r>
-        <w:t xml:space="preserve">Saisissez la</w:t>
-      </w:r>
-      <w:r>
-        <w:t xml:space="preserve"> </w:t>
-      </w:r>
-      <w:r>
-        <w:rPr>
-          <w:bCs/>
-          <w:b/>
-        </w:rPr>
-        <w:t xml:space="preserve">Référence de quittance</w:t>
-      </w:r>
-      <w:r>
-        <w:t xml:space="preserve"> </w:t>
-      </w:r>
-      <w:r>
-        <w:t xml:space="preserve">exacte.</w:t>
+        <w:rPr>
+          <w:bCs/>
+          <w:b/>
+        </w:rPr>
+        <w:t xml:space="preserve">Pendant le mois M+1</w:t>
+      </w:r>
+      <w:r>
+        <w:t xml:space="preserve"> </w:t>
+      </w:r>
+      <w:r>
+        <w:t xml:space="preserve">: les compagnies déclarent leurs virements sur leur plateforme ; dans</w:t>
+      </w:r>
+      <w:r>
+        <w:t xml:space="preserve"> </w:t>
+      </w:r>
+      <w:r>
+        <w:rPr>
+          <w:bCs/>
+          <w:b/>
+        </w:rPr>
+        <w:t xml:space="preserve">Paiements à valider</w:t>
+      </w:r>
+      <w:r>
+        <w:t xml:space="preserve">, rapprochez chaque déclaration du relevé du compte de collecte, puis</w:t>
+      </w:r>
+      <w:r>
+        <w:t xml:space="preserve"> </w:t>
+      </w:r>
+      <w:r>
+        <w:rPr>
+          <w:bCs/>
+          <w:b/>
+        </w:rPr>
+        <w:t xml:space="preserve">Valider</w:t>
+      </w:r>
+      <w:r>
+        <w:t xml:space="preserve"> </w:t>
+      </w:r>
+      <w:r>
+        <w:t xml:space="preserve">ou</w:t>
+      </w:r>
+      <w:r>
+        <w:t xml:space="preserve"> </w:t>
+      </w:r>
+      <w:r>
+        <w:rPr>
+          <w:bCs/>
+          <w:b/>
+        </w:rPr>
+        <w:t xml:space="preserve">Rejeter</w:t>
+      </w:r>
+      <w:r>
+        <w:t xml:space="preserve"> </w:t>
+      </w:r>
+      <w:r>
+        <w:t xml:space="preserve">(avec un motif). Dans le circuit</w:t>
+      </w:r>
+      <w:r>
+        <w:t xml:space="preserve"> </w:t>
+      </w:r>
+      <w:r>
+        <w:rPr>
+          <w:rStyle w:val="VerbatimChar"/>
+        </w:rPr>
+        <w:t xml:space="preserve">TRESOR</w:t>
+      </w:r>
+      <w:r>
+        <w:t xml:space="preserve">, enregistrez aussi l'encaissement à réception de chaque quittance du Receveur général du Trésor.</w:t>
       </w:r>
     </w:p>
     <w:p>
@@ -7131,6 +7412,257 @@
         <w:pStyle w:val="Compact"/>
       </w:pPr>
       <w:r>
+        <w:rPr>
+          <w:bCs/>
+          <w:b/>
+        </w:rPr>
+        <w:t xml:space="preserve">Fin du mois M+1</w:t>
+      </w:r>
+      <w:r>
+        <w:t xml:space="preserve"> </w:t>
+      </w:r>
+      <w:r>
+        <w:t xml:space="preserve">: échéance. Les factures non soldées par des paiements validés passent</w:t>
+      </w:r>
+      <w:r>
+        <w:t xml:space="preserve"> </w:t>
+      </w:r>
+      <w:r>
+        <w:rPr>
+          <w:bCs/>
+          <w:b/>
+        </w:rPr>
+        <w:t xml:space="preserve">EN RETARD</w:t>
+      </w:r>
+      <w:r>
+        <w:t xml:space="preserve"> </w:t>
+      </w:r>
+      <w:r>
+        <w:t xml:space="preserve">; la pénalité de 5 % par mois de retard s'applique au reste dû.</w:t>
+      </w:r>
+    </w:p>
+    <w:p>
+      <w:pPr>
+        <w:numPr>
+          <w:ilvl w:val="0"/>
+          <w:numId w:val="1013"/>
+        </w:numPr>
+        <w:pStyle w:val="Compact"/>
+      </w:pPr>
+      <w:r>
+        <w:rPr>
+          <w:bCs/>
+          <w:b/>
+        </w:rPr>
+        <w:t xml:space="preserve">Le 15 du mois M+2</w:t>
+      </w:r>
+      <w:r>
+        <w:t xml:space="preserve"> </w:t>
+      </w:r>
+      <w:r>
+        <w:t xml:space="preserve">(circuit</w:t>
+      </w:r>
+      <w:r>
+        <w:t xml:space="preserve"> </w:t>
+      </w:r>
+      <w:r>
+        <w:rPr>
+          <w:rStyle w:val="VerbatimChar"/>
+        </w:rPr>
+        <w:t xml:space="preserve">OPERATEUR</w:t>
+      </w:r>
+      <w:r>
+        <w:t xml:space="preserve">) : dans</w:t>
+      </w:r>
+      <w:r>
+        <w:t xml:space="preserve"> </w:t>
+      </w:r>
+      <w:r>
+        <w:rPr>
+          <w:bCs/>
+          <w:b/>
+        </w:rPr>
+        <w:t xml:space="preserve">Reversements à l'État</w:t>
+      </w:r>
+      <w:r>
+        <w:t xml:space="preserve">, enregistrez le virement de la part de l'État au Receveur général du Trésor avec sa référence.</w:t>
+      </w:r>
+    </w:p>
+    <w:p>
+      <w:pPr>
+        <w:numPr>
+          <w:ilvl w:val="0"/>
+          <w:numId w:val="1013"/>
+        </w:numPr>
+        <w:pStyle w:val="Compact"/>
+      </w:pPr>
+      <w:r>
+        <w:rPr>
+          <w:bCs/>
+          <w:b/>
+        </w:rPr>
+        <w:t xml:space="preserve">Chaque mois</w:t>
+      </w:r>
+      <w:r>
+        <w:t xml:space="preserve"> </w:t>
+      </w:r>
+      <w:r>
+        <w:t xml:space="preserve">: examinez l'onglet</w:t>
+      </w:r>
+      <w:r>
+        <w:t xml:space="preserve"> </w:t>
+      </w:r>
+      <w:r>
+        <w:rPr>
+          <w:bCs/>
+          <w:b/>
+        </w:rPr>
+        <w:t xml:space="preserve">Rapprochement</w:t>
+      </w:r>
+      <w:r>
+        <w:t xml:space="preserve"> </w:t>
+      </w:r>
+      <w:r>
+        <w:t xml:space="preserve">et exportez les données (</w:t>
+      </w:r>
+      <w:r>
+        <w:rPr>
+          <w:bCs/>
+          <w:b/>
+        </w:rPr>
+        <w:t xml:space="preserve">Exporter</w:t>
+      </w:r>
+      <w:r>
+        <w:t xml:space="preserve">) pour la comptabilité publique.</w:t>
+      </w:r>
+    </w:p>
+    <w:bookmarkEnd w:id="49"/>
+    <w:bookmarkStart w:id="50" w:name="enregistrer-un-encaissement"/>
+    <w:p>
+      <w:pPr>
+        <w:pStyle w:val="Heading3"/>
+      </w:pPr>
+      <w:r>
+        <w:t xml:space="preserve">Enregistrer un encaissement</w:t>
+      </w:r>
+    </w:p>
+    <w:p>
+      <w:pPr>
+        <w:pStyle w:val="FirstParagraph"/>
+      </w:pPr>
+      <w:r>
+        <w:t xml:space="preserve">Pour un paiement que la compagnie n'a pas déclaré sur sa plateforme :</w:t>
+      </w:r>
+    </w:p>
+    <w:p>
+      <w:pPr>
+        <w:numPr>
+          <w:ilvl w:val="0"/>
+          <w:numId w:val="1014"/>
+        </w:numPr>
+        <w:pStyle w:val="Compact"/>
+      </w:pPr>
+      <w:r>
+        <w:t xml:space="preserve">Ouvrez</w:t>
+      </w:r>
+      <w:r>
+        <w:t xml:space="preserve"> </w:t>
+      </w:r>
+      <w:r>
+        <w:rPr>
+          <w:bCs/>
+          <w:b/>
+        </w:rPr>
+        <w:t xml:space="preserve">Factures compagnies</w:t>
+      </w:r>
+      <w:r>
+        <w:t xml:space="preserve"> </w:t>
+      </w:r>
+      <w:r>
+        <w:t xml:space="preserve">et cliquez sur la facture.</w:t>
+      </w:r>
+    </w:p>
+    <w:p>
+      <w:pPr>
+        <w:numPr>
+          <w:ilvl w:val="0"/>
+          <w:numId w:val="1014"/>
+        </w:numPr>
+        <w:pStyle w:val="Compact"/>
+      </w:pPr>
+      <w:r>
+        <w:t xml:space="preserve">Dans</w:t>
+      </w:r>
+      <w:r>
+        <w:t xml:space="preserve"> </w:t>
+      </w:r>
+      <w:r>
+        <w:rPr>
+          <w:bCs/>
+          <w:b/>
+        </w:rPr>
+        <w:t xml:space="preserve">Enregistrer un encaissement (relevé du compte de collecte)</w:t>
+      </w:r>
+      <w:r>
+        <w:t xml:space="preserve"> </w:t>
+      </w:r>
+      <w:r>
+        <w:t xml:space="preserve">ou</w:t>
+      </w:r>
+      <w:r>
+        <w:t xml:space="preserve"> </w:t>
+      </w:r>
+      <w:r>
+        <w:rPr>
+          <w:bCs/>
+          <w:b/>
+        </w:rPr>
+        <w:t xml:space="preserve">Enregistrer un encaissement (quittance du Trésor)</w:t>
+      </w:r>
+      <w:r>
+        <w:t xml:space="preserve"> </w:t>
+      </w:r>
+      <w:r>
+        <w:t xml:space="preserve">selon le circuit, vérifiez le montant (prérempli avec le reste dû et les pénalités) et corrigez-le si le relevé ou la quittance porte un autre montant.</w:t>
+      </w:r>
+    </w:p>
+    <w:p>
+      <w:pPr>
+        <w:numPr>
+          <w:ilvl w:val="0"/>
+          <w:numId w:val="1014"/>
+        </w:numPr>
+        <w:pStyle w:val="Compact"/>
+      </w:pPr>
+      <w:r>
+        <w:t xml:space="preserve">Saisissez la</w:t>
+      </w:r>
+      <w:r>
+        <w:t xml:space="preserve"> </w:t>
+      </w:r>
+      <w:r>
+        <w:rPr>
+          <w:bCs/>
+          <w:b/>
+        </w:rPr>
+        <w:t xml:space="preserve">Référence de quittance</w:t>
+      </w:r>
+      <w:r>
+        <w:t xml:space="preserve"> </w:t>
+      </w:r>
+      <w:r>
+        <w:t xml:space="preserve">exacte.</w:t>
+      </w:r>
+    </w:p>
+    <w:p>
+      <w:pPr>
+        <w:numPr>
+          <w:ilvl w:val="0"/>
+          <w:numId w:val="1014"/>
+        </w:numPr>
+        <w:pStyle w:val="Compact"/>
+      </w:pPr>
+      <w:r>
         <w:t xml:space="preserve">Cliquez sur</w:t>
       </w:r>
       <w:r>
@@ -7147,8 +7679,8 @@
         <w:t xml:space="preserve">.</w:t>
       </w:r>
     </w:p>
-    <w:bookmarkEnd w:id="49"/>
-    <w:bookmarkStart w:id="50" w:name="situations-courantes-5"/>
+    <w:bookmarkEnd w:id="50"/>
+    <w:bookmarkStart w:id="51" w:name="situations-courantes-5"/>
     <w:p>
       <w:pPr>
         <w:pStyle w:val="Heading3"/>
@@ -7372,9 +7904,9 @@
         <w:t xml:space="preserve">Dans le démonstrateur, les compagnies, montants et encaissements sont fictifs.</w:t>
       </w:r>
     </w:p>
-    <w:bookmarkEnd w:id="50"/>
     <w:bookmarkEnd w:id="51"/>
-    <w:bookmarkStart w:id="55" w:name="X64456d3cd99699c3772dd726a69383f64ddaad7"/>
+    <w:bookmarkEnd w:id="52"/>
+    <w:bookmarkStart w:id="56" w:name="X64456d3cd99699c3772dd726a69383f64ddaad7"/>
     <w:p>
       <w:pPr>
         <w:pStyle w:val="Heading2"/>
@@ -7445,156 +7977,13 @@
         <w:t xml:space="preserve">). Leurs systèmes transmettent aussi les messages à la passerelle transporteurs avec une clé propre, liée à leur code IATA.</w:t>
       </w:r>
     </w:p>
-    <w:bookmarkStart w:id="52" w:name="raccordement"/>
+    <w:bookmarkStart w:id="53" w:name="raccordement"/>
     <w:p>
       <w:pPr>
         <w:pStyle w:val="Heading3"/>
       </w:pPr>
       <w:r>
         <w:t xml:space="preserve">Raccordement</w:t>
-      </w:r>
-    </w:p>
-    <w:p>
-      <w:pPr>
-        <w:numPr>
-          <w:ilvl w:val="0"/>
-          <w:numId w:val="1014"/>
-        </w:numPr>
-        <w:pStyle w:val="Compact"/>
-      </w:pPr>
-      <w:r>
-        <w:t xml:space="preserve">La compagnie désigne un correspondant technique et un correspondant sûreté.</w:t>
-      </w:r>
-    </w:p>
-    <w:p>
-      <w:pPr>
-        <w:numPr>
-          <w:ilvl w:val="0"/>
-          <w:numId w:val="1014"/>
-        </w:numPr>
-        <w:pStyle w:val="Compact"/>
-      </w:pPr>
-      <w:r>
-        <w:t xml:space="preserve">L'administrateur crée ses comptes utilisateurs (rôle</w:t>
-      </w:r>
-      <w:r>
-        <w:t xml:space="preserve"> </w:t>
-      </w:r>
-      <w:r>
-        <w:rPr>
-          <w:bCs/>
-          <w:b/>
-        </w:rPr>
-        <w:t xml:space="preserve">Compagnie aérienne</w:t>
-      </w:r>
-      <w:r>
-        <w:t xml:space="preserve">, compagnie choisie dans la liste) et l'administration lui remet sa clé</w:t>
-      </w:r>
-      <w:r>
-        <w:t xml:space="preserve"> </w:t>
-      </w:r>
-      <w:r>
-        <w:rPr>
-          <w:rStyle w:val="VerbatimChar"/>
-        </w:rPr>
-        <w:t xml:space="preserve">X-Carrier-Key</w:t>
-      </w:r>
-      <w:r>
-        <w:t xml:space="preserve"> </w:t>
-      </w:r>
-      <w:r>
-        <w:t xml:space="preserve">par un canal sûr.</w:t>
-      </w:r>
-    </w:p>
-    <w:p>
-      <w:pPr>
-        <w:numPr>
-          <w:ilvl w:val="0"/>
-          <w:numId w:val="1014"/>
-        </w:numPr>
-        <w:pStyle w:val="Compact"/>
-      </w:pPr>
-      <w:r>
-        <w:t xml:space="preserve">La compagnie envoie des messages d'essai (PAXLST et PNR) sur l'environnement indiqué par l'administration et vérifie la réponse</w:t>
-      </w:r>
-      <w:r>
-        <w:t xml:space="preserve"> </w:t>
-      </w:r>
-      <w:r>
-        <w:rPr>
-          <w:bCs/>
-          <w:b/>
-        </w:rPr>
-        <w:t xml:space="preserve">202</w:t>
-      </w:r>
-      <w:r>
-        <w:t xml:space="preserve"> </w:t>
-      </w:r>
-      <w:r>
-        <w:t xml:space="preserve">et la référence</w:t>
-      </w:r>
-      <w:r>
-        <w:t xml:space="preserve"> </w:t>
-      </w:r>
-      <w:r>
-        <w:rPr>
-          <w:rStyle w:val="VerbatimChar"/>
-        </w:rPr>
-        <w:t xml:space="preserve">MSG-…</w:t>
-      </w:r>
-      <w:r>
-        <w:t xml:space="preserve">.</w:t>
-      </w:r>
-    </w:p>
-    <w:p>
-      <w:pPr>
-        <w:numPr>
-          <w:ilvl w:val="0"/>
-          <w:numId w:val="1014"/>
-        </w:numPr>
-        <w:pStyle w:val="Compact"/>
-      </w:pPr>
-      <w:r>
-        <w:t xml:space="preserve">L'analyste confirme la bonne réception dans</w:t>
-      </w:r>
-      <w:r>
-        <w:t xml:space="preserve"> </w:t>
-      </w:r>
-      <w:r>
-        <w:rPr>
-          <w:bCs/>
-          <w:b/>
-        </w:rPr>
-        <w:t xml:space="preserve">Passerelle transporteurs</w:t>
-      </w:r>
-      <w:r>
-        <w:t xml:space="preserve"> </w:t>
-      </w:r>
-      <w:r>
-        <w:t xml:space="preserve">(statut</w:t>
-      </w:r>
-      <w:r>
-        <w:t xml:space="preserve"> </w:t>
-      </w:r>
-      <w:r>
-        <w:rPr>
-          <w:bCs/>
-          <w:b/>
-        </w:rPr>
-        <w:t xml:space="preserve">ACCEPTÉ</w:t>
-      </w:r>
-      <w:r>
-        <w:t xml:space="preserve">, complétude).</w:t>
-      </w:r>
-    </w:p>
-    <w:bookmarkEnd w:id="52"/>
-    <w:bookmarkStart w:id="53" w:name="transmission-quotidienne"/>
-    <w:p>
-      <w:pPr>
-        <w:pStyle w:val="Heading3"/>
-      </w:pPr>
-      <w:r>
-        <w:t xml:space="preserve">Transmission quotidienne</w:t>
       </w:r>
     </w:p>
     <w:p>
@@ -7606,17 +7995,7 @@
         <w:pStyle w:val="Compact"/>
       </w:pPr>
       <w:r>
-        <w:rPr>
-          <w:bCs/>
-          <w:b/>
-        </w:rPr>
-        <w:t xml:space="preserve">PNR</w:t>
-      </w:r>
-      <w:r>
-        <w:t xml:space="preserve"> </w:t>
-      </w:r>
-      <w:r>
-        <w:t xml:space="preserve">: à H-48 puis à H-24 avant le départ prévu.</w:t>
+        <w:t xml:space="preserve">La compagnie désigne un correspondant technique et un correspondant sûreté.</w:t>
       </w:r>
     </w:p>
     <w:p>
@@ -7628,17 +8007,35 @@
         <w:pStyle w:val="Compact"/>
       </w:pPr>
       <w:r>
-        <w:rPr>
-          <w:bCs/>
-          <w:b/>
-        </w:rPr>
-        <w:t xml:space="preserve">API (PAXLST)</w:t>
-      </w:r>
-      <w:r>
-        <w:t xml:space="preserve"> </w:t>
-      </w:r>
-      <w:r>
-        <w:t xml:space="preserve">: à la clôture de l'enregistrement, au plus tard à la fermeture des portes.</w:t>
+        <w:t xml:space="preserve">L'administrateur crée ses comptes utilisateurs (rôle</w:t>
+      </w:r>
+      <w:r>
+        <w:t xml:space="preserve"> </w:t>
+      </w:r>
+      <w:r>
+        <w:rPr>
+          <w:bCs/>
+          <w:b/>
+        </w:rPr>
+        <w:t xml:space="preserve">Compagnie aérienne</w:t>
+      </w:r>
+      <w:r>
+        <w:t xml:space="preserve">, compagnie choisie dans la liste) et l'administration lui remet sa clé</w:t>
+      </w:r>
+      <w:r>
+        <w:t xml:space="preserve"> </w:t>
+      </w:r>
+      <w:r>
+        <w:rPr>
+          <w:rStyle w:val="VerbatimChar"/>
+        </w:rPr>
+        <w:t xml:space="preserve">X-Carrier-Key</w:t>
+      </w:r>
+      <w:r>
+        <w:t xml:space="preserve"> </w:t>
+      </w:r>
+      <w:r>
+        <w:t xml:space="preserve">par un canal sûr.</w:t>
       </w:r>
     </w:p>
     <w:p>
@@ -7650,6 +8047,141 @@
         <w:pStyle w:val="Compact"/>
       </w:pPr>
       <w:r>
+        <w:t xml:space="preserve">La compagnie envoie des messages d'essai (PAXLST et PNR) sur l'environnement indiqué par l'administration et vérifie la réponse</w:t>
+      </w:r>
+      <w:r>
+        <w:t xml:space="preserve"> </w:t>
+      </w:r>
+      <w:r>
+        <w:rPr>
+          <w:bCs/>
+          <w:b/>
+        </w:rPr>
+        <w:t xml:space="preserve">202</w:t>
+      </w:r>
+      <w:r>
+        <w:t xml:space="preserve"> </w:t>
+      </w:r>
+      <w:r>
+        <w:t xml:space="preserve">et la référence</w:t>
+      </w:r>
+      <w:r>
+        <w:t xml:space="preserve"> </w:t>
+      </w:r>
+      <w:r>
+        <w:rPr>
+          <w:rStyle w:val="VerbatimChar"/>
+        </w:rPr>
+        <w:t xml:space="preserve">MSG-…</w:t>
+      </w:r>
+      <w:r>
+        <w:t xml:space="preserve">.</w:t>
+      </w:r>
+    </w:p>
+    <w:p>
+      <w:pPr>
+        <w:numPr>
+          <w:ilvl w:val="0"/>
+          <w:numId w:val="1015"/>
+        </w:numPr>
+        <w:pStyle w:val="Compact"/>
+      </w:pPr>
+      <w:r>
+        <w:t xml:space="preserve">L'analyste confirme la bonne réception dans</w:t>
+      </w:r>
+      <w:r>
+        <w:t xml:space="preserve"> </w:t>
+      </w:r>
+      <w:r>
+        <w:rPr>
+          <w:bCs/>
+          <w:b/>
+        </w:rPr>
+        <w:t xml:space="preserve">Passerelle transporteurs</w:t>
+      </w:r>
+      <w:r>
+        <w:t xml:space="preserve"> </w:t>
+      </w:r>
+      <w:r>
+        <w:t xml:space="preserve">(statut</w:t>
+      </w:r>
+      <w:r>
+        <w:t xml:space="preserve"> </w:t>
+      </w:r>
+      <w:r>
+        <w:rPr>
+          <w:bCs/>
+          <w:b/>
+        </w:rPr>
+        <w:t xml:space="preserve">ACCEPTÉ</w:t>
+      </w:r>
+      <w:r>
+        <w:t xml:space="preserve">, complétude).</w:t>
+      </w:r>
+    </w:p>
+    <w:bookmarkEnd w:id="53"/>
+    <w:bookmarkStart w:id="54" w:name="transmission-quotidienne"/>
+    <w:p>
+      <w:pPr>
+        <w:pStyle w:val="Heading3"/>
+      </w:pPr>
+      <w:r>
+        <w:t xml:space="preserve">Transmission quotidienne</w:t>
+      </w:r>
+    </w:p>
+    <w:p>
+      <w:pPr>
+        <w:numPr>
+          <w:ilvl w:val="0"/>
+          <w:numId w:val="1016"/>
+        </w:numPr>
+        <w:pStyle w:val="Compact"/>
+      </w:pPr>
+      <w:r>
+        <w:rPr>
+          <w:bCs/>
+          <w:b/>
+        </w:rPr>
+        <w:t xml:space="preserve">PNR</w:t>
+      </w:r>
+      <w:r>
+        <w:t xml:space="preserve"> </w:t>
+      </w:r>
+      <w:r>
+        <w:t xml:space="preserve">: à H-48 puis à H-24 avant le départ prévu.</w:t>
+      </w:r>
+    </w:p>
+    <w:p>
+      <w:pPr>
+        <w:numPr>
+          <w:ilvl w:val="0"/>
+          <w:numId w:val="1016"/>
+        </w:numPr>
+        <w:pStyle w:val="Compact"/>
+      </w:pPr>
+      <w:r>
+        <w:rPr>
+          <w:bCs/>
+          <w:b/>
+        </w:rPr>
+        <w:t xml:space="preserve">API (PAXLST)</w:t>
+      </w:r>
+      <w:r>
+        <w:t xml:space="preserve"> </w:t>
+      </w:r>
+      <w:r>
+        <w:t xml:space="preserve">: à la clôture de l'enregistrement, au plus tard à la fermeture des portes.</w:t>
+      </w:r>
+    </w:p>
+    <w:p>
+      <w:pPr>
+        <w:numPr>
+          <w:ilvl w:val="0"/>
+          <w:numId w:val="1016"/>
+        </w:numPr>
+        <w:pStyle w:val="Compact"/>
+      </w:pPr>
+      <w:r>
         <w:t xml:space="preserve">Conservez la référence</w:t>
       </w:r>
       <w:r>
@@ -7684,8 +8216,8 @@
         <w:t xml:space="preserve">de la plateforme des compagnies.</w:t>
       </w:r>
     </w:p>
-    <w:bookmarkEnd w:id="53"/>
-    <w:bookmarkStart w:id="54" w:name="situations-courantes-6"/>
+    <w:bookmarkEnd w:id="54"/>
+    <w:bookmarkStart w:id="55" w:name="situations-courantes-6"/>
     <w:p>
       <w:pPr>
         <w:pStyle w:val="Heading3"/>
@@ -7956,9 +8488,9 @@
         <w:t xml:space="preserve">Aucun résultat de ciblage n'est renvoyé à la compagnie : ni sur la plateforme, ni dans l'accusé de réception de la passerelle (pas de nombre de passagers signalés).</w:t>
       </w:r>
     </w:p>
-    <w:bookmarkEnd w:id="54"/>
     <w:bookmarkEnd w:id="55"/>
-    <w:bookmarkStart w:id="59" w:name="voyageur"/>
+    <w:bookmarkEnd w:id="56"/>
+    <w:bookmarkStart w:id="60" w:name="voyageur"/>
     <w:p>
       <w:pPr>
         <w:pStyle w:val="Heading2"/>
@@ -7967,7 +8499,7 @@
         <w:t xml:space="preserve">Voyageur</w:t>
       </w:r>
     </w:p>
-    <w:bookmarkStart w:id="56" w:name="sur-le-portail-"/>
+    <w:bookmarkStart w:id="57" w:name="sur-le-portail-"/>
     <w:p>
       <w:pPr>
         <w:pStyle w:val="Heading3"/>
@@ -7983,232 +8515,6 @@
       </w:r>
       <w:r>
         <w:t xml:space="preserve">)</w:t>
-      </w:r>
-    </w:p>
-    <w:p>
-      <w:pPr>
-        <w:numPr>
-          <w:ilvl w:val="0"/>
-          <w:numId w:val="1016"/>
-        </w:numPr>
-        <w:pStyle w:val="Compact"/>
-      </w:pPr>
-      <w:r>
-        <w:t xml:space="preserve">Vérifiez si votre nationalité est dispensée de visa (</w:t>
-      </w:r>
-      <w:r>
-        <w:rPr>
-          <w:bCs/>
-          <w:b/>
-        </w:rPr>
-        <w:t xml:space="preserve">Ai-je besoin d'un visa ?</w:t>
-      </w:r>
-      <w:r>
-        <w:t xml:space="preserve">).</w:t>
-      </w:r>
-    </w:p>
-    <w:p>
-      <w:pPr>
-        <w:numPr>
-          <w:ilvl w:val="0"/>
-          <w:numId w:val="1016"/>
-        </w:numPr>
-        <w:pStyle w:val="Compact"/>
-      </w:pPr>
-      <w:r>
-        <w:t xml:space="preserve">Si un e-Visa est requis, remplissez les 4 étapes (Identité avec la MRZ, Voyage, Santé, Paiement), donnez votre consentement et cliquez sur</w:t>
-      </w:r>
-      <w:r>
-        <w:t xml:space="preserve"> </w:t>
-      </w:r>
-      <w:r>
-        <w:rPr>
-          <w:bCs/>
-          <w:b/>
-        </w:rPr>
-        <w:t xml:space="preserve">Payer et soumettre</w:t>
-      </w:r>
-      <w:r>
-        <w:t xml:space="preserve">. Conservez la référence</w:t>
-      </w:r>
-      <w:r>
-        <w:t xml:space="preserve"> </w:t>
-      </w:r>
-      <w:r>
-        <w:rPr>
-          <w:rStyle w:val="VerbatimChar"/>
-        </w:rPr>
-        <w:t xml:space="preserve">EV…</w:t>
-      </w:r>
-      <w:r>
-        <w:t xml:space="preserve">.</w:t>
-      </w:r>
-    </w:p>
-    <w:p>
-      <w:pPr>
-        <w:numPr>
-          <w:ilvl w:val="0"/>
-          <w:numId w:val="1016"/>
-        </w:numPr>
-        <w:pStyle w:val="Compact"/>
-      </w:pPr>
-      <w:r>
-        <w:t xml:space="preserve">Suivez la demande dans l'onglet</w:t>
-      </w:r>
-      <w:r>
-        <w:t xml:space="preserve"> </w:t>
-      </w:r>
-      <w:r>
-        <w:rPr>
-          <w:bCs/>
-          <w:b/>
-        </w:rPr>
-        <w:t xml:space="preserve">Suivi</w:t>
-      </w:r>
-      <w:r>
-        <w:t xml:space="preserve"> </w:t>
-      </w:r>
-      <w:r>
-        <w:t xml:space="preserve">(référence et numéro de passeport). Si le statut est</w:t>
-      </w:r>
-      <w:r>
-        <w:t xml:space="preserve"> </w:t>
-      </w:r>
-      <w:r>
-        <w:rPr>
-          <w:bCs/>
-          <w:b/>
-        </w:rPr>
-        <w:t xml:space="preserve">Info. demandée</w:t>
-      </w:r>
-      <w:r>
-        <w:t xml:space="preserve">, répondez dans</w:t>
-      </w:r>
-      <w:r>
-        <w:t xml:space="preserve"> </w:t>
-      </w:r>
-      <w:r>
-        <w:rPr>
-          <w:bCs/>
-          <w:b/>
-        </w:rPr>
-        <w:t xml:space="preserve">Votre réponse</w:t>
-      </w:r>
-      <w:r>
-        <w:t xml:space="preserve">.</w:t>
-      </w:r>
-    </w:p>
-    <w:p>
-      <w:pPr>
-        <w:numPr>
-          <w:ilvl w:val="0"/>
-          <w:numId w:val="1016"/>
-        </w:numPr>
-        <w:pStyle w:val="Compact"/>
-      </w:pPr>
-      <w:r>
-        <w:t xml:space="preserve">Une fois l'e-Visa</w:t>
-      </w:r>
-      <w:r>
-        <w:t xml:space="preserve"> </w:t>
-      </w:r>
-      <w:r>
-        <w:rPr>
-          <w:bCs/>
-          <w:b/>
-        </w:rPr>
-        <w:t xml:space="preserve">Approuvé</w:t>
-      </w:r>
-      <w:r>
-        <w:t xml:space="preserve">, imprimez ou enregistrez le QR code et présentez-le avec le passeport à la frontière.</w:t>
-      </w:r>
-    </w:p>
-    <w:p>
-      <w:pPr>
-        <w:numPr>
-          <w:ilvl w:val="0"/>
-          <w:numId w:val="1016"/>
-        </w:numPr>
-        <w:pStyle w:val="Compact"/>
-      </w:pPr>
-      <w:r>
-        <w:t xml:space="preserve">Le cas échéant, pré-enregistrez-vous pour les eGates dans l'onglet</w:t>
-      </w:r>
-      <w:r>
-        <w:t xml:space="preserve"> </w:t>
-      </w:r>
-      <w:r>
-        <w:rPr>
-          <w:bCs/>
-          <w:b/>
-        </w:rPr>
-        <w:t xml:space="preserve">eGate</w:t>
-      </w:r>
-      <w:r>
-        <w:t xml:space="preserve">. La redevance de sécurité est incluse dans le billet : vous n'avez rien à payer (carte</w:t>
-      </w:r>
-      <w:r>
-        <w:t xml:space="preserve"> </w:t>
-      </w:r>
-      <w:r>
-        <w:rPr>
-          <w:bCs/>
-          <w:b/>
-        </w:rPr>
-        <w:t xml:space="preserve">Redevance de sécurité</w:t>
-      </w:r>
-      <w:r>
-        <w:t xml:space="preserve"> </w:t>
-      </w:r>
-      <w:r>
-        <w:t xml:space="preserve">de l'accueil).</w:t>
-      </w:r>
-    </w:p>
-    <w:bookmarkEnd w:id="56"/>
-    <w:bookmarkStart w:id="57" w:name="X15229387e36313f8a31b4697b6b87a66a7a0105"/>
-    <w:p>
-      <w:pPr>
-        <w:pStyle w:val="Heading3"/>
-      </w:pPr>
-      <w:r>
-        <w:t xml:space="preserve">Avec l'application mobile WawID e-Visa (iPhone et Android)</w:t>
-      </w:r>
-    </w:p>
-    <w:p>
-      <w:pPr>
-        <w:pStyle w:val="FirstParagraph"/>
-      </w:pPr>
-      <w:r>
-        <w:t xml:space="preserve">L'application permet de déposer la demande en lisant la puce du passeport. Elle fonctionne sur</w:t>
-      </w:r>
-      <w:r>
-        <w:t xml:space="preserve"> </w:t>
-      </w:r>
-      <w:r>
-        <w:rPr>
-          <w:bCs/>
-          <w:b/>
-        </w:rPr>
-        <w:t xml:space="preserve">iPhone 7 ou plus récent (iOS 15.5 ou plus)</w:t>
-      </w:r>
-      <w:r>
-        <w:t xml:space="preserve"> </w:t>
-      </w:r>
-      <w:r>
-        <w:t xml:space="preserve">et sur</w:t>
-      </w:r>
-      <w:r>
-        <w:t xml:space="preserve"> </w:t>
-      </w:r>
-      <w:r>
-        <w:rPr>
-          <w:bCs/>
-          <w:b/>
-        </w:rPr>
-        <w:t xml:space="preserve">Android 7 ou plus récent équipé du NFC</w:t>
-      </w:r>
-      <w:r>
-        <w:t xml:space="preserve">.</w:t>
       </w:r>
     </w:p>
     <w:p>
@@ -8220,17 +8526,17 @@
         <w:pStyle w:val="Compact"/>
       </w:pPr>
       <w:r>
-        <w:rPr>
-          <w:bCs/>
-          <w:b/>
-        </w:rPr>
-        <w:t xml:space="preserve">Scanner la MRZ</w:t>
-      </w:r>
-      <w:r>
-        <w:t xml:space="preserve"> </w:t>
-      </w:r>
-      <w:r>
-        <w:t xml:space="preserve">avec la caméra (ou la saisir). Les chiffres de contrôle doivent être valides : la MRZ sert de clé pour ouvrir la puce.</w:t>
+        <w:t xml:space="preserve">Vérifiez si votre nationalité est dispensée de visa (</w:t>
+      </w:r>
+      <w:r>
+        <w:rPr>
+          <w:bCs/>
+          <w:b/>
+        </w:rPr>
+        <w:t xml:space="preserve">Ai-je besoin d'un visa ?</w:t>
+      </w:r>
+      <w:r>
+        <w:t xml:space="preserve">).</w:t>
       </w:r>
     </w:p>
     <w:p>
@@ -8242,17 +8548,32 @@
         <w:pStyle w:val="Compact"/>
       </w:pPr>
       <w:r>
-        <w:rPr>
-          <w:bCs/>
-          <w:b/>
-        </w:rPr>
-        <w:t xml:space="preserve">Lire la puce</w:t>
-      </w:r>
-      <w:r>
-        <w:t xml:space="preserve"> </w:t>
-      </w:r>
-      <w:r>
-        <w:t xml:space="preserve">: passeport fermé à plat, approchez le haut de l'iPhone ou le dos du téléphone Android (zone NFC) de la couverture, ne bougez plus jusqu'au message de succès. L'application lit les données d'identité (DG1) et la photo (DG2) et vérifie leur intégrité par rapport à la signature de la puce (SOD).</w:t>
+        <w:t xml:space="preserve">Si un e-Visa est requis, remplissez les 4 étapes (Identité avec la MRZ, Voyage, Santé, Paiement), donnez votre consentement et cliquez sur</w:t>
+      </w:r>
+      <w:r>
+        <w:t xml:space="preserve"> </w:t>
+      </w:r>
+      <w:r>
+        <w:rPr>
+          <w:bCs/>
+          <w:b/>
+        </w:rPr>
+        <w:t xml:space="preserve">Payer et soumettre</w:t>
+      </w:r>
+      <w:r>
+        <w:t xml:space="preserve">. Conservez la référence</w:t>
+      </w:r>
+      <w:r>
+        <w:t xml:space="preserve"> </w:t>
+      </w:r>
+      <w:r>
+        <w:rPr>
+          <w:rStyle w:val="VerbatimChar"/>
+        </w:rPr>
+        <w:t xml:space="preserve">EV…</w:t>
+      </w:r>
+      <w:r>
+        <w:t xml:space="preserve">.</w:t>
       </w:r>
     </w:p>
     <w:p>
@@ -8264,17 +8585,49 @@
         <w:pStyle w:val="Compact"/>
       </w:pPr>
       <w:r>
-        <w:rPr>
-          <w:bCs/>
-          <w:b/>
-        </w:rPr>
-        <w:t xml:space="preserve">Compléter</w:t>
-      </w:r>
-      <w:r>
-        <w:t xml:space="preserve"> </w:t>
-      </w:r>
-      <w:r>
-        <w:t xml:space="preserve">les informations de séjour et la déclaration sanitaire.</w:t>
+        <w:t xml:space="preserve">Suivez la demande dans l'onglet</w:t>
+      </w:r>
+      <w:r>
+        <w:t xml:space="preserve"> </w:t>
+      </w:r>
+      <w:r>
+        <w:rPr>
+          <w:bCs/>
+          <w:b/>
+        </w:rPr>
+        <w:t xml:space="preserve">Suivi</w:t>
+      </w:r>
+      <w:r>
+        <w:t xml:space="preserve"> </w:t>
+      </w:r>
+      <w:r>
+        <w:t xml:space="preserve">(référence et numéro de passeport). Si le statut est</w:t>
+      </w:r>
+      <w:r>
+        <w:t xml:space="preserve"> </w:t>
+      </w:r>
+      <w:r>
+        <w:rPr>
+          <w:bCs/>
+          <w:b/>
+        </w:rPr>
+        <w:t xml:space="preserve">Info. demandée</w:t>
+      </w:r>
+      <w:r>
+        <w:t xml:space="preserve">, répondez dans</w:t>
+      </w:r>
+      <w:r>
+        <w:t xml:space="preserve"> </w:t>
+      </w:r>
+      <w:r>
+        <w:rPr>
+          <w:bCs/>
+          <w:b/>
+        </w:rPr>
+        <w:t xml:space="preserve">Votre réponse</w:t>
+      </w:r>
+      <w:r>
+        <w:t xml:space="preserve">.</w:t>
       </w:r>
     </w:p>
     <w:p>
@@ -8286,17 +8639,20 @@
         <w:pStyle w:val="Compact"/>
       </w:pPr>
       <w:r>
-        <w:rPr>
-          <w:bCs/>
-          <w:b/>
-        </w:rPr>
-        <w:t xml:space="preserve">Payer et déposer</w:t>
-      </w:r>
-      <w:r>
-        <w:t xml:space="preserve"> </w:t>
-      </w:r>
-      <w:r>
-        <w:t xml:space="preserve">(paiement de démonstration dans la version actuelle). Conservez la référence.</w:t>
+        <w:t xml:space="preserve">Une fois l'e-Visa</w:t>
+      </w:r>
+      <w:r>
+        <w:t xml:space="preserve"> </w:t>
+      </w:r>
+      <w:r>
+        <w:rPr>
+          <w:bCs/>
+          <w:b/>
+        </w:rPr>
+        <w:t xml:space="preserve">Approuvé</w:t>
+      </w:r>
+      <w:r>
+        <w:t xml:space="preserve">, imprimez ou enregistrez le QR code et présentez-le avec le passeport à la frontière.</w:t>
       </w:r>
     </w:p>
     <w:p>
@@ -8308,6 +8664,182 @@
         <w:pStyle w:val="Compact"/>
       </w:pPr>
       <w:r>
+        <w:t xml:space="preserve">Le cas échéant, pré-enregistrez-vous pour les eGates dans l'onglet</w:t>
+      </w:r>
+      <w:r>
+        <w:t xml:space="preserve"> </w:t>
+      </w:r>
+      <w:r>
+        <w:rPr>
+          <w:bCs/>
+          <w:b/>
+        </w:rPr>
+        <w:t xml:space="preserve">eGate</w:t>
+      </w:r>
+      <w:r>
+        <w:t xml:space="preserve">. La redevance de sécurité est incluse dans le billet : vous n'avez rien à payer (carte</w:t>
+      </w:r>
+      <w:r>
+        <w:t xml:space="preserve"> </w:t>
+      </w:r>
+      <w:r>
+        <w:rPr>
+          <w:bCs/>
+          <w:b/>
+        </w:rPr>
+        <w:t xml:space="preserve">Redevance de sécurité</w:t>
+      </w:r>
+      <w:r>
+        <w:t xml:space="preserve"> </w:t>
+      </w:r>
+      <w:r>
+        <w:t xml:space="preserve">de l'accueil).</w:t>
+      </w:r>
+    </w:p>
+    <w:bookmarkEnd w:id="57"/>
+    <w:bookmarkStart w:id="58" w:name="X15229387e36313f8a31b4697b6b87a66a7a0105"/>
+    <w:p>
+      <w:pPr>
+        <w:pStyle w:val="Heading3"/>
+      </w:pPr>
+      <w:r>
+        <w:t xml:space="preserve">Avec l'application mobile WawID e-Visa (iPhone et Android)</w:t>
+      </w:r>
+    </w:p>
+    <w:p>
+      <w:pPr>
+        <w:pStyle w:val="FirstParagraph"/>
+      </w:pPr>
+      <w:r>
+        <w:t xml:space="preserve">L'application permet de déposer la demande en lisant la puce du passeport. Elle fonctionne sur</w:t>
+      </w:r>
+      <w:r>
+        <w:t xml:space="preserve"> </w:t>
+      </w:r>
+      <w:r>
+        <w:rPr>
+          <w:bCs/>
+          <w:b/>
+        </w:rPr>
+        <w:t xml:space="preserve">iPhone 7 ou plus récent (iOS 15.5 ou plus)</w:t>
+      </w:r>
+      <w:r>
+        <w:t xml:space="preserve"> </w:t>
+      </w:r>
+      <w:r>
+        <w:t xml:space="preserve">et sur</w:t>
+      </w:r>
+      <w:r>
+        <w:t xml:space="preserve"> </w:t>
+      </w:r>
+      <w:r>
+        <w:rPr>
+          <w:bCs/>
+          <w:b/>
+        </w:rPr>
+        <w:t xml:space="preserve">Android 7 ou plus récent équipé du NFC</w:t>
+      </w:r>
+      <w:r>
+        <w:t xml:space="preserve">.</w:t>
+      </w:r>
+    </w:p>
+    <w:p>
+      <w:pPr>
+        <w:numPr>
+          <w:ilvl w:val="0"/>
+          <w:numId w:val="1018"/>
+        </w:numPr>
+        <w:pStyle w:val="Compact"/>
+      </w:pPr>
+      <w:r>
+        <w:rPr>
+          <w:bCs/>
+          <w:b/>
+        </w:rPr>
+        <w:t xml:space="preserve">Scanner la MRZ</w:t>
+      </w:r>
+      <w:r>
+        <w:t xml:space="preserve"> </w:t>
+      </w:r>
+      <w:r>
+        <w:t xml:space="preserve">avec la caméra (ou la saisir). Les chiffres de contrôle doivent être valides : la MRZ sert de clé pour ouvrir la puce.</w:t>
+      </w:r>
+    </w:p>
+    <w:p>
+      <w:pPr>
+        <w:numPr>
+          <w:ilvl w:val="0"/>
+          <w:numId w:val="1018"/>
+        </w:numPr>
+        <w:pStyle w:val="Compact"/>
+      </w:pPr>
+      <w:r>
+        <w:rPr>
+          <w:bCs/>
+          <w:b/>
+        </w:rPr>
+        <w:t xml:space="preserve">Lire la puce</w:t>
+      </w:r>
+      <w:r>
+        <w:t xml:space="preserve"> </w:t>
+      </w:r>
+      <w:r>
+        <w:t xml:space="preserve">: passeport fermé à plat, approchez le haut de l'iPhone ou le dos du téléphone Android (zone NFC) de la couverture, ne bougez plus jusqu'au message de succès. L'application lit les données d'identité (DG1) et la photo (DG2) et vérifie leur intégrité par rapport à la signature de la puce (SOD).</w:t>
+      </w:r>
+    </w:p>
+    <w:p>
+      <w:pPr>
+        <w:numPr>
+          <w:ilvl w:val="0"/>
+          <w:numId w:val="1018"/>
+        </w:numPr>
+        <w:pStyle w:val="Compact"/>
+      </w:pPr>
+      <w:r>
+        <w:rPr>
+          <w:bCs/>
+          <w:b/>
+        </w:rPr>
+        <w:t xml:space="preserve">Compléter</w:t>
+      </w:r>
+      <w:r>
+        <w:t xml:space="preserve"> </w:t>
+      </w:r>
+      <w:r>
+        <w:t xml:space="preserve">les informations de séjour et la déclaration sanitaire.</w:t>
+      </w:r>
+    </w:p>
+    <w:p>
+      <w:pPr>
+        <w:numPr>
+          <w:ilvl w:val="0"/>
+          <w:numId w:val="1018"/>
+        </w:numPr>
+        <w:pStyle w:val="Compact"/>
+      </w:pPr>
+      <w:r>
+        <w:rPr>
+          <w:bCs/>
+          <w:b/>
+        </w:rPr>
+        <w:t xml:space="preserve">Payer et déposer</w:t>
+      </w:r>
+      <w:r>
+        <w:t xml:space="preserve"> </w:t>
+      </w:r>
+      <w:r>
+        <w:t xml:space="preserve">(paiement de démonstration dans la version actuelle). Conservez la référence.</w:t>
+      </w:r>
+    </w:p>
+    <w:p>
+      <w:pPr>
+        <w:numPr>
+          <w:ilvl w:val="0"/>
+          <w:numId w:val="1018"/>
+        </w:numPr>
+        <w:pStyle w:val="Compact"/>
+      </w:pPr>
+      <w:r>
         <w:rPr>
           <w:bCs/>
           <w:b/>
@@ -8321,8 +8853,8 @@
         <w:t xml:space="preserve">la demande dans l'application : statut, messages et, après approbation, QR code à présenter. L'application est disponible en français et en anglais (sélecteur FR / EN).</w:t>
       </w:r>
     </w:p>
-    <w:bookmarkEnd w:id="57"/>
-    <w:bookmarkStart w:id="58" w:name="situations-courantes-7"/>
+    <w:bookmarkEnd w:id="58"/>
+    <w:bookmarkStart w:id="59" w:name="situations-courantes-7"/>
     <w:p>
       <w:pPr>
         <w:pStyle w:val="Heading3"/>
@@ -8528,9 +9060,9 @@
         </w:tc>
       </w:tr>
     </w:tbl>
-    <w:bookmarkEnd w:id="58"/>
     <w:bookmarkEnd w:id="59"/>
-    <w:bookmarkStart w:id="68" w:name="X481559b7b293044da091fd253beafef6565d01b"/>
+    <w:bookmarkEnd w:id="60"/>
+    <w:bookmarkStart w:id="69" w:name="X481559b7b293044da091fd253beafef6565d01b"/>
     <w:p>
       <w:pPr>
         <w:pStyle w:val="Heading2"/>
@@ -8589,7 +9121,7 @@
         <w:t xml:space="preserve">). Cette section décrit ce que vous voyez et ce que vous faites dans chaque situation. Elle distingue ce qui existe aujourd'hui dans le démonstrateur et ce qui est prévu (Cible, À développer).</w:t>
       </w:r>
     </w:p>
-    <w:bookmarkStart w:id="60" w:name="les-situations-possibles"/>
+    <w:bookmarkStart w:id="61" w:name="les-situations-possibles"/>
     <w:p>
       <w:pPr>
         <w:pStyle w:val="Heading3"/>
@@ -8812,8 +9344,8 @@
         <w:t xml:space="preserve">Le point devant le nom du poste, dans la barre supérieure, indique seulement que le navigateur de votre poste de travail dispose d'une connexion réseau. Il peut rester vert alors que le serveur WawID ne répond pas : en cas de doute, fiez-vous aux messages d'erreur et prévenez le support.</w:t>
       </w:r>
     </w:p>
-    <w:bookmarkEnd w:id="60"/>
-    <w:bookmarkStart w:id="61" w:name="mode-dégradé-au-poste"/>
+    <w:bookmarkEnd w:id="61"/>
+    <w:bookmarkStart w:id="62" w:name="mode-dégradé-au-poste"/>
     <w:p>
       <w:pPr>
         <w:pStyle w:val="Heading3"/>
@@ -9162,112 +9694,14 @@
         </w:tc>
       </w:tr>
     </w:tbl>
-    <w:bookmarkEnd w:id="61"/>
-    <w:bookmarkStart w:id="62" w:name="X617ae861eee83713394f61bf313c5edec6b38f6"/>
+    <w:bookmarkEnd w:id="62"/>
+    <w:bookmarkStart w:id="63" w:name="X617ae861eee83713394f61bf313c5edec6b38f6"/>
     <w:p>
       <w:pPr>
         <w:pStyle w:val="Heading3"/>
       </w:pPr>
       <w:r>
         <w:t xml:space="preserve">Procédure de contrôle manuel (tant que le mode hors ligne n'existe pas)</w:t>
-      </w:r>
-    </w:p>
-    <w:p>
-      <w:pPr>
-        <w:numPr>
-          <w:ilvl w:val="0"/>
-          <w:numId w:val="1018"/>
-        </w:numPr>
-        <w:pStyle w:val="Compact"/>
-      </w:pPr>
-      <w:r>
-        <w:t xml:space="preserve">Le chef de vacation déclare le passage en mode dégradé et note l'heure.</w:t>
-      </w:r>
-    </w:p>
-    <w:p>
-      <w:pPr>
-        <w:numPr>
-          <w:ilvl w:val="0"/>
-          <w:numId w:val="1018"/>
-        </w:numPr>
-        <w:pStyle w:val="Compact"/>
-      </w:pPr>
-      <w:r>
-        <w:t xml:space="preserve">Le superviseur ferme les eGates (</w:t>
-      </w:r>
-      <w:r>
-        <w:rPr>
-          <w:bCs/>
-          <w:b/>
-        </w:rPr>
-        <w:t xml:space="preserve">Fermer</w:t>
-      </w:r>
-      <w:r>
-        <w:t xml:space="preserve">) si l'espace DPAF est encore accessible ; sinon, il fait orienter les voyageurs vers les guichets.</w:t>
-      </w:r>
-    </w:p>
-    <w:p>
-      <w:pPr>
-        <w:numPr>
-          <w:ilvl w:val="0"/>
-          <w:numId w:val="1018"/>
-        </w:numPr>
-        <w:pStyle w:val="Compact"/>
-      </w:pPr>
-      <w:r>
-        <w:t xml:space="preserve">Les agents appliquent le contrôle documentaire visuel renforcé prévu par la procédure de la DPAF et consultent les listes disponibles hors WawID selon les instructions de service.</w:t>
-      </w:r>
-    </w:p>
-    <w:p>
-      <w:pPr>
-        <w:numPr>
-          <w:ilvl w:val="0"/>
-          <w:numId w:val="1018"/>
-        </w:numPr>
-        <w:pStyle w:val="Compact"/>
-      </w:pPr>
-      <w:r>
-        <w:t xml:space="preserve">Chaque passage est consigné sur le registre prévu (papier ou fichier local autorisé), avec l'heure, le document, la décision et le nom de l'agent.</w:t>
-      </w:r>
-    </w:p>
-    <w:p>
-      <w:pPr>
-        <w:numPr>
-          <w:ilvl w:val="0"/>
-          <w:numId w:val="1018"/>
-        </w:numPr>
-        <w:pStyle w:val="Compact"/>
-      </w:pPr>
-      <w:r>
-        <w:t xml:space="preserve">Au retour du service, le chef de vacation organise la saisie différée des passages selon les consignes de la DPAF et clôt le mode dégradé en notant l'heure.</w:t>
-      </w:r>
-    </w:p>
-    <w:p>
-      <w:pPr>
-        <w:pStyle w:val="FirstParagraph"/>
-      </w:pPr>
-      <w:r>
-        <w:t xml:space="preserve">Les modalités exactes (registre, saisie différée, politique des eGates) sont fixées par la DPAF avant la mise en service (</w:t>
-      </w:r>
-      <w:r>
-        <w:rPr>
-          <w:bCs/>
-          <w:b/>
-        </w:rPr>
-        <w:t xml:space="preserve">À vérifier</w:t>
-      </w:r>
-      <w:r>
-        <w:t xml:space="preserve">).</w:t>
-      </w:r>
-    </w:p>
-    <w:bookmarkEnd w:id="62"/>
-    <w:bookmarkStart w:id="63" w:name="pendant-une-bascule-de-site-central"/>
-    <w:p>
-      <w:pPr>
-        <w:pStyle w:val="Heading3"/>
-      </w:pPr>
-      <w:r>
-        <w:t xml:space="preserve">Pendant une bascule de site central</w:t>
       </w:r>
     </w:p>
     <w:p>
@@ -9279,7 +9713,7 @@
         <w:pStyle w:val="Compact"/>
       </w:pPr>
       <w:r>
-        <w:t xml:space="preserve">La bascule est décidée et conduite par l'exploitant ; vous n'avez aucune action technique à faire.</w:t>
+        <w:t xml:space="preserve">Le chef de vacation déclare le passage en mode dégradé et note l'heure.</w:t>
       </w:r>
     </w:p>
     <w:p>
@@ -9291,7 +9725,17 @@
         <w:pStyle w:val="Compact"/>
       </w:pPr>
       <w:r>
-        <w:t xml:space="preserve">Votre session peut rester valide, mais il peut vous être demandé de vous reconnecter : faites-le avec votre propre compte.</w:t>
+        <w:t xml:space="preserve">Le superviseur ferme les eGates (</w:t>
+      </w:r>
+      <w:r>
+        <w:rPr>
+          <w:bCs/>
+          <w:b/>
+        </w:rPr>
+        <w:t xml:space="preserve">Fermer</w:t>
+      </w:r>
+      <w:r>
+        <w:t xml:space="preserve">) si l'espace DPAF est encore accessible ; sinon, il fait orienter les voyageurs vers les guichets.</w:t>
       </w:r>
     </w:p>
     <w:p>
@@ -9303,46 +9747,7 @@
         <w:pStyle w:val="Compact"/>
       </w:pPr>
       <w:r>
-        <w:t xml:space="preserve">Si une action était en cours au moment de l'erreur (décision de passage, encaissement, déclaration, message),</w:t>
-      </w:r>
-      <w:r>
-        <w:t xml:space="preserve"> </w:t>
-      </w:r>
-      <w:r>
-        <w:rPr>
-          <w:bCs/>
-          <w:b/>
-        </w:rPr>
-        <w:t xml:space="preserve">vérifiez d'abord qu'elle n'a pas été enregistrée</w:t>
-      </w:r>
-      <w:r>
-        <w:t xml:space="preserve"> </w:t>
-      </w:r>
-      <w:r>
-        <w:t xml:space="preserve">(</w:t>
-      </w:r>
-      <w:r>
-        <w:rPr>
-          <w:bCs/>
-          <w:b/>
-        </w:rPr>
-        <w:t xml:space="preserve">Passages</w:t>
-      </w:r>
-      <w:r>
-        <w:t xml:space="preserve">, fiche de la facture, écran</w:t>
-      </w:r>
-      <w:r>
-        <w:t xml:space="preserve"> </w:t>
-      </w:r>
-      <w:r>
-        <w:rPr>
-          <w:bCs/>
-          <w:b/>
-        </w:rPr>
-        <w:t xml:space="preserve">Messages</w:t>
-      </w:r>
-      <w:r>
-        <w:t xml:space="preserve">) avant de la refaire, pour éviter les doublons.</w:t>
+        <w:t xml:space="preserve">Les agents appliquent le contrôle documentaire visuel renforcé prévu par la procédure de la DPAF et consultent les listes disponibles hors WawID selon les instructions de service.</w:t>
       </w:r>
     </w:p>
     <w:p>
@@ -9354,6 +9759,133 @@
         <w:pStyle w:val="Compact"/>
       </w:pPr>
       <w:r>
+        <w:t xml:space="preserve">Chaque passage est consigné sur le registre prévu (papier ou fichier local autorisé), avec l'heure, le document, la décision et le nom de l'agent.</w:t>
+      </w:r>
+    </w:p>
+    <w:p>
+      <w:pPr>
+        <w:numPr>
+          <w:ilvl w:val="0"/>
+          <w:numId w:val="1019"/>
+        </w:numPr>
+        <w:pStyle w:val="Compact"/>
+      </w:pPr>
+      <w:r>
+        <w:t xml:space="preserve">Au retour du service, le chef de vacation organise la saisie différée des passages selon les consignes de la DPAF et clôt le mode dégradé en notant l'heure.</w:t>
+      </w:r>
+    </w:p>
+    <w:p>
+      <w:pPr>
+        <w:pStyle w:val="FirstParagraph"/>
+      </w:pPr>
+      <w:r>
+        <w:t xml:space="preserve">Les modalités exactes (registre, saisie différée, politique des eGates) sont fixées par la DPAF avant la mise en service (</w:t>
+      </w:r>
+      <w:r>
+        <w:rPr>
+          <w:bCs/>
+          <w:b/>
+        </w:rPr>
+        <w:t xml:space="preserve">À vérifier</w:t>
+      </w:r>
+      <w:r>
+        <w:t xml:space="preserve">).</w:t>
+      </w:r>
+    </w:p>
+    <w:bookmarkEnd w:id="63"/>
+    <w:bookmarkStart w:id="64" w:name="pendant-une-bascule-de-site-central"/>
+    <w:p>
+      <w:pPr>
+        <w:pStyle w:val="Heading3"/>
+      </w:pPr>
+      <w:r>
+        <w:t xml:space="preserve">Pendant une bascule de site central</w:t>
+      </w:r>
+    </w:p>
+    <w:p>
+      <w:pPr>
+        <w:numPr>
+          <w:ilvl w:val="0"/>
+          <w:numId w:val="1020"/>
+        </w:numPr>
+        <w:pStyle w:val="Compact"/>
+      </w:pPr>
+      <w:r>
+        <w:t xml:space="preserve">La bascule est décidée et conduite par l'exploitant ; vous n'avez aucune action technique à faire.</w:t>
+      </w:r>
+    </w:p>
+    <w:p>
+      <w:pPr>
+        <w:numPr>
+          <w:ilvl w:val="0"/>
+          <w:numId w:val="1020"/>
+        </w:numPr>
+        <w:pStyle w:val="Compact"/>
+      </w:pPr>
+      <w:r>
+        <w:t xml:space="preserve">Votre session peut rester valide, mais il peut vous être demandé de vous reconnecter : faites-le avec votre propre compte.</w:t>
+      </w:r>
+    </w:p>
+    <w:p>
+      <w:pPr>
+        <w:numPr>
+          <w:ilvl w:val="0"/>
+          <w:numId w:val="1020"/>
+        </w:numPr>
+        <w:pStyle w:val="Compact"/>
+      </w:pPr>
+      <w:r>
+        <w:t xml:space="preserve">Si une action était en cours au moment de l'erreur (décision de passage, encaissement, déclaration, message),</w:t>
+      </w:r>
+      <w:r>
+        <w:t xml:space="preserve"> </w:t>
+      </w:r>
+      <w:r>
+        <w:rPr>
+          <w:bCs/>
+          <w:b/>
+        </w:rPr>
+        <w:t xml:space="preserve">vérifiez d'abord qu'elle n'a pas été enregistrée</w:t>
+      </w:r>
+      <w:r>
+        <w:t xml:space="preserve"> </w:t>
+      </w:r>
+      <w:r>
+        <w:t xml:space="preserve">(</w:t>
+      </w:r>
+      <w:r>
+        <w:rPr>
+          <w:bCs/>
+          <w:b/>
+        </w:rPr>
+        <w:t xml:space="preserve">Passages</w:t>
+      </w:r>
+      <w:r>
+        <w:t xml:space="preserve">, fiche de la facture, écran</w:t>
+      </w:r>
+      <w:r>
+        <w:t xml:space="preserve"> </w:t>
+      </w:r>
+      <w:r>
+        <w:rPr>
+          <w:bCs/>
+          <w:b/>
+        </w:rPr>
+        <w:t xml:space="preserve">Messages</w:t>
+      </w:r>
+      <w:r>
+        <w:t xml:space="preserve">) avant de la refaire, pour éviter les doublons.</w:t>
+      </w:r>
+    </w:p>
+    <w:p>
+      <w:pPr>
+        <w:numPr>
+          <w:ilvl w:val="0"/>
+          <w:numId w:val="1020"/>
+        </w:numPr>
+        <w:pStyle w:val="Compact"/>
+      </w:pPr>
+      <w:r>
         <w:t xml:space="preserve">Le superviseur de poste vérifie ensuite le</w:t>
       </w:r>
       <w:r>
@@ -9383,8 +9915,8 @@
         <w:t xml:space="preserve">).</w:t>
       </w:r>
     </w:p>
-    <w:bookmarkEnd w:id="63"/>
-    <w:bookmarkStart w:id="64" w:name="maintenance-planifiée"/>
+    <w:bookmarkEnd w:id="64"/>
+    <w:bookmarkStart w:id="65" w:name="maintenance-planifiée"/>
     <w:p>
       <w:pPr>
         <w:pStyle w:val="Heading3"/>
@@ -9401,8 +9933,8 @@
         <w:t xml:space="preserve">Les maintenances sont réalisées site par site et, sauf exception, sans interruption du service. Elles sont annoncées à l'avance aux postes, aux compagnies et au Trésor, de préférence aux heures creuses. Une maintenance qui impose une interruption est validée avec la DPAF.</w:t>
       </w:r>
     </w:p>
-    <w:bookmarkEnd w:id="64"/>
-    <w:bookmarkStart w:id="65" w:name="notes-par-profil"/>
+    <w:bookmarkEnd w:id="65"/>
+    <w:bookmarkStart w:id="66" w:name="notes-par-profil"/>
     <w:p>
       <w:pPr>
         <w:pStyle w:val="Heading3"/>
@@ -9727,191 +10259,14 @@
         </w:tc>
       </w:tr>
     </w:tbl>
-    <w:bookmarkEnd w:id="65"/>
-    <w:bookmarkStart w:id="66" w:name="X1d44a75189e9ded01f79138ab27035732066e67"/>
+    <w:bookmarkEnd w:id="66"/>
+    <w:bookmarkStart w:id="67" w:name="X1d44a75189e9ded01f79138ab27035732066e67"/>
     <w:p>
       <w:pPr>
         <w:pStyle w:val="Heading3"/>
       </w:pPr>
       <w:r>
         <w:t xml:space="preserve">Compagnies aériennes : renvoi des messages</w:t>
-      </w:r>
-    </w:p>
-    <w:p>
-      <w:pPr>
-        <w:numPr>
-          <w:ilvl w:val="0"/>
-          <w:numId w:val="1020"/>
-        </w:numPr>
-        <w:pStyle w:val="Compact"/>
-      </w:pPr>
-      <w:r>
-        <w:t xml:space="preserve">Si la passerelle ne répond pas ou renvoie une erreur serveur (</w:t>
-      </w:r>
-      <w:r>
-        <w:rPr>
-          <w:rStyle w:val="VerbatimChar"/>
-        </w:rPr>
-        <w:t xml:space="preserve">500</w:t>
-      </w:r>
-      <w:r>
-        <w:t xml:space="preserve"> </w:t>
-      </w:r>
-      <w:r>
-        <w:t xml:space="preserve">ou absence de réponse), renvoyez le</w:t>
-      </w:r>
-      <w:r>
-        <w:t xml:space="preserve"> </w:t>
-      </w:r>
-      <w:r>
-        <w:rPr>
-          <w:bCs/>
-          <w:b/>
-        </w:rPr>
-        <w:t xml:space="preserve">même</w:t>
-      </w:r>
-      <w:r>
-        <w:t xml:space="preserve"> </w:t>
-      </w:r>
-      <w:r>
-        <w:t xml:space="preserve">message un peu plus tard. Une réponse</w:t>
-      </w:r>
-      <w:r>
-        <w:t xml:space="preserve"> </w:t>
-      </w:r>
-      <w:r>
-        <w:rPr>
-          <w:rStyle w:val="VerbatimChar"/>
-        </w:rPr>
-        <w:t xml:space="preserve">401</w:t>
-      </w:r>
-      <w:r>
-        <w:t xml:space="preserve"> </w:t>
-      </w:r>
-      <w:r>
-        <w:t xml:space="preserve">ou</w:t>
-      </w:r>
-      <w:r>
-        <w:t xml:space="preserve"> </w:t>
-      </w:r>
-      <w:r>
-        <w:rPr>
-          <w:rStyle w:val="VerbatimChar"/>
-        </w:rPr>
-        <w:t xml:space="preserve">422</w:t>
-      </w:r>
-      <w:r>
-        <w:t xml:space="preserve"> </w:t>
-      </w:r>
-      <w:r>
-        <w:t xml:space="preserve">ne se corrige pas en renvoyant le même message.</w:t>
-      </w:r>
-    </w:p>
-    <w:p>
-      <w:pPr>
-        <w:numPr>
-          <w:ilvl w:val="0"/>
-          <w:numId w:val="1020"/>
-        </w:numPr>
-        <w:pStyle w:val="Compact"/>
-      </w:pPr>
-      <w:r>
-        <w:rPr>
-          <w:bCs/>
-          <w:b/>
-        </w:rPr>
-        <w:t xml:space="preserve">Existant</w:t>
-      </w:r>
-      <w:r>
-        <w:t xml:space="preserve"> </w:t>
-      </w:r>
-      <w:r>
-        <w:t xml:space="preserve">: un renvoi crée un nouveau message avec une nouvelle référence</w:t>
-      </w:r>
-      <w:r>
-        <w:t xml:space="preserve"> </w:t>
-      </w:r>
-      <w:r>
-        <w:rPr>
-          <w:rStyle w:val="VerbatimChar"/>
-        </w:rPr>
-        <w:t xml:space="preserve">MSG-…</w:t>
-      </w:r>
-      <w:r>
-        <w:t xml:space="preserve"> </w:t>
-      </w:r>
-      <w:r>
-        <w:t xml:space="preserve">(les deux apparaissent dans l'écran</w:t>
-      </w:r>
-      <w:r>
-        <w:t xml:space="preserve"> </w:t>
-      </w:r>
-      <w:r>
-        <w:rPr>
-          <w:bCs/>
-          <w:b/>
-        </w:rPr>
-        <w:t xml:space="preserve">Messages</w:t>
-      </w:r>
-      <w:r>
-        <w:t xml:space="preserve">), mais les passagers d'un même vol, à la même date, sont fusionnés par numéro de document : le renvoi ne crée pas de passagers en double.</w:t>
-      </w:r>
-    </w:p>
-    <w:p>
-      <w:pPr>
-        <w:numPr>
-          <w:ilvl w:val="0"/>
-          <w:numId w:val="1020"/>
-        </w:numPr>
-        <w:pStyle w:val="Compact"/>
-      </w:pPr>
-      <w:r>
-        <w:rPr>
-          <w:bCs/>
-          <w:b/>
-        </w:rPr>
-        <w:t xml:space="preserve">À développer</w:t>
-      </w:r>
-      <w:r>
-        <w:t xml:space="preserve"> </w:t>
-      </w:r>
-      <w:r>
-        <w:t xml:space="preserve">: une clé d'idempotence explicite (même référence renvoyée pour un message déjà reçu) et des consignes de renvoi automatique documentées dans</w:t>
-      </w:r>
-      <w:r>
-        <w:t xml:space="preserve"> </w:t>
-      </w:r>
-      <w:r>
-        <w:rPr>
-          <w:iCs/>
-          <w:i/>
-        </w:rPr>
-        <w:t xml:space="preserve">Référence API (compagnies, équipements, connecteurs)</w:t>
-      </w:r>
-      <w:r>
-        <w:t xml:space="preserve">.</w:t>
-      </w:r>
-    </w:p>
-    <w:p>
-      <w:pPr>
-        <w:numPr>
-          <w:ilvl w:val="0"/>
-          <w:numId w:val="1020"/>
-        </w:numPr>
-        <w:pStyle w:val="Compact"/>
-      </w:pPr>
-      <w:r>
-        <w:t xml:space="preserve">Déclaration d'un paiement de redevance : en cas d'erreur, vérifiez d'abord dans la facture si la déclaration apparaît ; une déclaration renvoyée crée une seconde déclaration, que le Trésor rejettera comme doublon.</w:t>
-      </w:r>
-    </w:p>
-    <w:bookmarkEnd w:id="66"/>
-    <w:bookmarkStart w:id="67" w:name="Xdbee472e6736e01862ccd47da13241b8dbc8033"/>
-    <w:p>
-      <w:pPr>
-        <w:pStyle w:val="Heading3"/>
-      </w:pPr>
-      <w:r>
-        <w:t xml:space="preserve">Sauvegardes et restaurations (administrateur)</w:t>
       </w:r>
     </w:p>
     <w:p>
@@ -9923,7 +10278,65 @@
         <w:pStyle w:val="Compact"/>
       </w:pPr>
       <w:r>
-        <w:t xml:space="preserve">Les sauvegardes sont automatiques et gérées par l'exploitant ; aucun utilisateur n'a d'action à faire.</w:t>
+        <w:t xml:space="preserve">Si la passerelle ne répond pas ou renvoie une erreur serveur (</w:t>
+      </w:r>
+      <w:r>
+        <w:rPr>
+          <w:rStyle w:val="VerbatimChar"/>
+        </w:rPr>
+        <w:t xml:space="preserve">500</w:t>
+      </w:r>
+      <w:r>
+        <w:t xml:space="preserve"> </w:t>
+      </w:r>
+      <w:r>
+        <w:t xml:space="preserve">ou absence de réponse), renvoyez le</w:t>
+      </w:r>
+      <w:r>
+        <w:t xml:space="preserve"> </w:t>
+      </w:r>
+      <w:r>
+        <w:rPr>
+          <w:bCs/>
+          <w:b/>
+        </w:rPr>
+        <w:t xml:space="preserve">même</w:t>
+      </w:r>
+      <w:r>
+        <w:t xml:space="preserve"> </w:t>
+      </w:r>
+      <w:r>
+        <w:t xml:space="preserve">message un peu plus tard. Une réponse</w:t>
+      </w:r>
+      <w:r>
+        <w:t xml:space="preserve"> </w:t>
+      </w:r>
+      <w:r>
+        <w:rPr>
+          <w:rStyle w:val="VerbatimChar"/>
+        </w:rPr>
+        <w:t xml:space="preserve">401</w:t>
+      </w:r>
+      <w:r>
+        <w:t xml:space="preserve"> </w:t>
+      </w:r>
+      <w:r>
+        <w:t xml:space="preserve">ou</w:t>
+      </w:r>
+      <w:r>
+        <w:t xml:space="preserve"> </w:t>
+      </w:r>
+      <w:r>
+        <w:rPr>
+          <w:rStyle w:val="VerbatimChar"/>
+        </w:rPr>
+        <w:t xml:space="preserve">422</w:t>
+      </w:r>
+      <w:r>
+        <w:t xml:space="preserve"> </w:t>
+      </w:r>
+      <w:r>
+        <w:t xml:space="preserve">ne se corrige pas en renvoyant le même message.</w:t>
       </w:r>
     </w:p>
     <w:p>
@@ -9935,7 +10348,45 @@
         <w:pStyle w:val="Compact"/>
       </w:pPr>
       <w:r>
-        <w:t xml:space="preserve">Une demande de restauration (donnée effacée ou modifiée par erreur, incident) est adressée par l'administrateur à l'exploitant (niveau N2), par écrit, avec l'objet, la date et l'heure concernées et le motif. Elle exige l'accord de la DPAF et l'intervention de deux personnes habilitées.</w:t>
+        <w:rPr>
+          <w:bCs/>
+          <w:b/>
+        </w:rPr>
+        <w:t xml:space="preserve">Existant</w:t>
+      </w:r>
+      <w:r>
+        <w:t xml:space="preserve"> </w:t>
+      </w:r>
+      <w:r>
+        <w:t xml:space="preserve">: un renvoi crée un nouveau message avec une nouvelle référence</w:t>
+      </w:r>
+      <w:r>
+        <w:t xml:space="preserve"> </w:t>
+      </w:r>
+      <w:r>
+        <w:rPr>
+          <w:rStyle w:val="VerbatimChar"/>
+        </w:rPr>
+        <w:t xml:space="preserve">MSG-…</w:t>
+      </w:r>
+      <w:r>
+        <w:t xml:space="preserve"> </w:t>
+      </w:r>
+      <w:r>
+        <w:t xml:space="preserve">(les deux apparaissent dans l'écran</w:t>
+      </w:r>
+      <w:r>
+        <w:t xml:space="preserve"> </w:t>
+      </w:r>
+      <w:r>
+        <w:rPr>
+          <w:bCs/>
+          <w:b/>
+        </w:rPr>
+        <w:t xml:space="preserve">Messages</w:t>
+      </w:r>
+      <w:r>
+        <w:t xml:space="preserve">), mais les passagers d'un même vol, à la même date, sont fusionnés par numéro de document : le renvoi ne crée pas de passagers en double.</w:t>
       </w:r>
     </w:p>
     <w:p>
@@ -9947,33 +10398,27 @@
         <w:pStyle w:val="Compact"/>
       </w:pPr>
       <w:r>
-        <w:t xml:space="preserve">Une restauration ne doit jamais servir à effacer une trace du</w:t>
-      </w:r>
-      <w:r>
-        <w:t xml:space="preserve"> </w:t>
-      </w:r>
-      <w:r>
-        <w:rPr>
-          <w:bCs/>
-          <w:b/>
-        </w:rPr>
-        <w:t xml:space="preserve">Journal d'audit</w:t>
-      </w:r>
-      <w:r>
-        <w:t xml:space="preserve"> </w:t>
-      </w:r>
-      <w:r>
-        <w:t xml:space="preserve">; après toute restauration, l'administrateur vérifie la</w:t>
-      </w:r>
-      <w:r>
-        <w:t xml:space="preserve"> </w:t>
-      </w:r>
-      <w:r>
-        <w:rPr>
-          <w:bCs/>
-          <w:b/>
-        </w:rPr>
-        <w:t xml:space="preserve">Chaîne intègre</w:t>
+        <w:rPr>
+          <w:bCs/>
+          <w:b/>
+        </w:rPr>
+        <w:t xml:space="preserve">À développer</w:t>
+      </w:r>
+      <w:r>
+        <w:t xml:space="preserve"> </w:t>
+      </w:r>
+      <w:r>
+        <w:t xml:space="preserve">: une clé d'idempotence explicite (même référence renvoyée pour un message déjà reçu) et des consignes de renvoi automatique documentées dans</w:t>
+      </w:r>
+      <w:r>
+        <w:t xml:space="preserve"> </w:t>
+      </w:r>
+      <w:r>
+        <w:rPr>
+          <w:iCs/>
+          <w:i/>
+        </w:rPr>
+        <w:t xml:space="preserve">Référence API (compagnies, équipements, connecteurs)</w:t>
       </w:r>
       <w:r>
         <w:t xml:space="preserve">.</w:t>
@@ -9988,6 +10433,93 @@
         <w:pStyle w:val="Compact"/>
       </w:pPr>
       <w:r>
+        <w:t xml:space="preserve">Déclaration d'un paiement de redevance : en cas d'erreur, vérifiez d'abord dans la facture si la déclaration apparaît ; une déclaration renvoyée crée une seconde déclaration, que le Trésor rejettera comme doublon.</w:t>
+      </w:r>
+    </w:p>
+    <w:bookmarkEnd w:id="67"/>
+    <w:bookmarkStart w:id="68" w:name="Xdbee472e6736e01862ccd47da13241b8dbc8033"/>
+    <w:p>
+      <w:pPr>
+        <w:pStyle w:val="Heading3"/>
+      </w:pPr>
+      <w:r>
+        <w:t xml:space="preserve">Sauvegardes et restaurations (administrateur)</w:t>
+      </w:r>
+    </w:p>
+    <w:p>
+      <w:pPr>
+        <w:numPr>
+          <w:ilvl w:val="0"/>
+          <w:numId w:val="1022"/>
+        </w:numPr>
+        <w:pStyle w:val="Compact"/>
+      </w:pPr>
+      <w:r>
+        <w:t xml:space="preserve">Les sauvegardes sont automatiques et gérées par l'exploitant ; aucun utilisateur n'a d'action à faire.</w:t>
+      </w:r>
+    </w:p>
+    <w:p>
+      <w:pPr>
+        <w:numPr>
+          <w:ilvl w:val="0"/>
+          <w:numId w:val="1022"/>
+        </w:numPr>
+        <w:pStyle w:val="Compact"/>
+      </w:pPr>
+      <w:r>
+        <w:t xml:space="preserve">Une demande de restauration (donnée effacée ou modifiée par erreur, incident) est adressée par l'administrateur à l'exploitant (niveau N2), par écrit, avec l'objet, la date et l'heure concernées et le motif. Elle exige l'accord de la DPAF et l'intervention de deux personnes habilitées.</w:t>
+      </w:r>
+    </w:p>
+    <w:p>
+      <w:pPr>
+        <w:numPr>
+          <w:ilvl w:val="0"/>
+          <w:numId w:val="1022"/>
+        </w:numPr>
+        <w:pStyle w:val="Compact"/>
+      </w:pPr>
+      <w:r>
+        <w:t xml:space="preserve">Une restauration ne doit jamais servir à effacer une trace du</w:t>
+      </w:r>
+      <w:r>
+        <w:t xml:space="preserve"> </w:t>
+      </w:r>
+      <w:r>
+        <w:rPr>
+          <w:bCs/>
+          <w:b/>
+        </w:rPr>
+        <w:t xml:space="preserve">Journal d'audit</w:t>
+      </w:r>
+      <w:r>
+        <w:t xml:space="preserve"> </w:t>
+      </w:r>
+      <w:r>
+        <w:t xml:space="preserve">; après toute restauration, l'administrateur vérifie la</w:t>
+      </w:r>
+      <w:r>
+        <w:t xml:space="preserve"> </w:t>
+      </w:r>
+      <w:r>
+        <w:rPr>
+          <w:bCs/>
+          <w:b/>
+        </w:rPr>
+        <w:t xml:space="preserve">Chaîne intègre</w:t>
+      </w:r>
+      <w:r>
+        <w:t xml:space="preserve">.</w:t>
+      </w:r>
+    </w:p>
+    <w:p>
+      <w:pPr>
+        <w:numPr>
+          <w:ilvl w:val="0"/>
+          <w:numId w:val="1022"/>
+        </w:numPr>
+        <w:pStyle w:val="Compact"/>
+      </w:pPr>
+      <w:r>
         <w:t xml:space="preserve">Dans le démonstrateur, il n'existe pas de sauvegarde dédiée ;</w:t>
       </w:r>
       <w:r>
@@ -10007,9 +10539,9 @@
         <w:t xml:space="preserve">n'est pas une restauration.</w:t>
       </w:r>
     </w:p>
-    <w:bookmarkEnd w:id="67"/>
     <w:bookmarkEnd w:id="68"/>
-    <w:bookmarkStart w:id="69" w:name="assistance-et-escalade"/>
+    <w:bookmarkEnd w:id="69"/>
+    <w:bookmarkStart w:id="70" w:name="assistance-et-escalade"/>
     <w:p>
       <w:pPr>
         <w:pStyle w:val="Heading2"/>
@@ -10316,7 +10848,7 @@
         <w:t xml:space="preserve">).</w:t>
       </w:r>
     </w:p>
-    <w:bookmarkEnd w:id="69"/>
+    <w:bookmarkEnd w:id="70"/>
     <w:sectPr/>
   </w:body>
 </w:document>
@@ -11101,12 +11633,42 @@
     </w:lvlOverride>
   </w:num>
   <w:num w:numId="1019">
-    <w:abstractNumId w:val="991"/>
+    <w:abstractNumId w:val="99411"/>
+    <w:lvlOverride w:ilvl="0">
+      <w:startOverride w:val="1"/>
+    </w:lvlOverride>
+    <w:lvlOverride w:ilvl="1">
+      <w:startOverride w:val="1"/>
+    </w:lvlOverride>
+    <w:lvlOverride w:ilvl="2">
+      <w:startOverride w:val="1"/>
+    </w:lvlOverride>
+    <w:lvlOverride w:ilvl="3">
+      <w:startOverride w:val="1"/>
+    </w:lvlOverride>
+    <w:lvlOverride w:ilvl="4">
+      <w:startOverride w:val="1"/>
+    </w:lvlOverride>
+    <w:lvlOverride w:ilvl="5">
+      <w:startOverride w:val="1"/>
+    </w:lvlOverride>
+    <w:lvlOverride w:ilvl="6">
+      <w:startOverride w:val="1"/>
+    </w:lvlOverride>
+    <w:lvlOverride w:ilvl="7">
+      <w:startOverride w:val="1"/>
+    </w:lvlOverride>
+    <w:lvlOverride w:ilvl="8">
+      <w:startOverride w:val="1"/>
+    </w:lvlOverride>
   </w:num>
   <w:num w:numId="1020">
     <w:abstractNumId w:val="991"/>
   </w:num>
   <w:num w:numId="1021">
+    <w:abstractNumId w:val="991"/>
+  </w:num>
+  <w:num w:numId="1022">
     <w:abstractNumId w:val="991"/>
   </w:num>
 </w:numbering>

</xml_diff>